<commit_message>
#docs: replace escopo to Âmbito
</commit_message>
<xml_diff>
--- a/docs/proposta_sistema/Proposta_Sistema_Grupo7.docx
+++ b/docs/proposta_sistema/Proposta_Sistema_Grupo7.docx
@@ -1135,15 +1135,7 @@
                                   </w:rPr>
                                 </w:pPr>
                                 <w:r>
-                                  <w:t xml:space="preserve">    </w:t>
-                                </w:r>
-                                <w:r>
-                                  <w:rPr>
-                                    <w:caps/>
-                                    <w:color w:val="333f4f" w:themeColor="text2" w:themeShade="BF"/>
-                                    <w:sz w:val="40"/>
-                                    <w:szCs w:val="40"/>
-                                  </w:rPr>
+                                  <w:t xml:space="preserve">2023-2024</w:t>
                                 </w:r>
                                 <w:r>
                                   <w:rPr>
@@ -1214,15 +1206,7 @@
                             </w:rPr>
                           </w:pPr>
                           <w:r>
-                            <w:t xml:space="preserve">    </w:t>
-                          </w:r>
-                          <w:r>
-                            <w:rPr>
-                              <w:caps/>
-                              <w:color w:val="333f4f" w:themeColor="text2" w:themeShade="BF"/>
-                              <w:sz w:val="40"/>
-                              <w:szCs w:val="40"/>
-                            </w:rPr>
+                            <w:t xml:space="preserve">2023-2024</w:t>
                           </w:r>
                           <w:r>
                             <w:rPr>
@@ -1478,7 +1462,7 @@
               <w:lang w:val="pt-PT"/>
             </w:rPr>
           </w:r>
-          <w:hyperlink w:tooltip="#_Toc1" w:anchor="_Toc1" w:history="1">
+          <w:hyperlink w:tooltip="#_Toc3" w:anchor="_Toc3" w:history="1">
             <w:r>
               <w:rPr>
                 <w:rStyle w:val="970"/>
@@ -1502,7 +1486,7 @@
             </w:r>
             <w:r>
               <w:fldChar w:fldCharType="begin"/>
-              <w:instrText xml:space="preserve">PAGEREF _Toc1 \h</w:instrText>
+              <w:instrText xml:space="preserve">PAGEREF _Toc3 \h</w:instrText>
               <w:fldChar w:fldCharType="separate"/>
               <w:t xml:space="preserve">3</w:t>
               <w:fldChar w:fldCharType="end"/>
@@ -1529,7 +1513,7 @@
             </w:rPr>
           </w:pPr>
           <w:r/>
-          <w:hyperlink w:tooltip="#_Toc2" w:anchor="_Toc2" w:history="1">
+          <w:hyperlink w:tooltip="#_Toc4" w:anchor="_Toc4" w:history="1">
             <w:r>
               <w:rPr>
                 <w:rStyle w:val="970"/>
@@ -1541,7 +1525,7 @@
                 <w:highlight w:val="none"/>
                 <w:lang w:val="pt-BR"/>
               </w:rPr>
-              <w:t xml:space="preserve">Escopo</w:t>
+              <w:t xml:space="preserve">Âmbito</w:t>
             </w:r>
             <w:r>
               <w:rPr>
@@ -1555,7 +1539,7 @@
             </w:r>
             <w:r>
               <w:fldChar w:fldCharType="begin"/>
-              <w:instrText xml:space="preserve">PAGEREF _Toc2 \h</w:instrText>
+              <w:instrText xml:space="preserve">PAGEREF _Toc4 \h</w:instrText>
               <w:fldChar w:fldCharType="separate"/>
               <w:t xml:space="preserve">4</w:t>
               <w:fldChar w:fldCharType="end"/>
@@ -1585,7 +1569,7 @@
             <w:rPr/>
           </w:pPr>
           <w:r/>
-          <w:hyperlink w:tooltip="#_Toc3" w:anchor="_Toc3" w:history="1">
+          <w:hyperlink w:tooltip="#_Toc5" w:anchor="_Toc5" w:history="1">
             <w:r>
               <w:rPr>
                 <w:rStyle w:val="970"/>
@@ -1597,7 +1581,15 @@
                 <w:highlight w:val="none"/>
                 <w:lang w:val="pt-BR"/>
               </w:rPr>
-              <w:t xml:space="preserve">Escopo funcional</w:t>
+              <w:t xml:space="preserve">Âmbito</w:t>
+            </w:r>
+            <w:r>
+              <w:rPr>
+                <w:rStyle w:val="970"/>
+                <w:highlight w:val="none"/>
+                <w:lang w:val="pt-BR"/>
+              </w:rPr>
+              <w:t xml:space="preserve"> Funcional</w:t>
             </w:r>
             <w:r>
               <w:rPr>
@@ -1610,7 +1602,7 @@
             </w:r>
             <w:r>
               <w:fldChar w:fldCharType="begin"/>
-              <w:instrText xml:space="preserve">PAGEREF _Toc3 \h</w:instrText>
+              <w:instrText xml:space="preserve">PAGEREF _Toc5 \h</w:instrText>
               <w:fldChar w:fldCharType="separate"/>
               <w:t xml:space="preserve">4</w:t>
               <w:fldChar w:fldCharType="end"/>
@@ -1636,7 +1628,7 @@
             <w:rPr/>
           </w:pPr>
           <w:r/>
-          <w:hyperlink w:tooltip="#_Toc4" w:anchor="_Toc4" w:history="1">
+          <w:hyperlink w:tooltip="#_Toc6" w:anchor="_Toc6" w:history="1">
             <w:r>
               <w:rPr>
                 <w:rFonts w:asciiTheme="majorHAnsi" w:hAnsiTheme="majorHAnsi" w:eastAsiaTheme="majorEastAsia" w:cstheme="majorBidi"/>
@@ -1686,7 +1678,7 @@
             </w:r>
             <w:r>
               <w:fldChar w:fldCharType="begin"/>
-              <w:instrText xml:space="preserve">PAGEREF _Toc4 \h</w:instrText>
+              <w:instrText xml:space="preserve">PAGEREF _Toc6 \h</w:instrText>
               <w:fldChar w:fldCharType="separate"/>
               <w:t xml:space="preserve">4</w:t>
               <w:fldChar w:fldCharType="end"/>
@@ -1712,7 +1704,7 @@
             <w:rPr/>
           </w:pPr>
           <w:r/>
-          <w:hyperlink w:tooltip="#_Toc5" w:anchor="_Toc5" w:history="1">
+          <w:hyperlink w:tooltip="#_Toc7" w:anchor="_Toc7" w:history="1">
             <w:r>
               <w:rPr>
                 <w:rFonts w:asciiTheme="majorHAnsi" w:hAnsiTheme="majorHAnsi" w:eastAsiaTheme="majorEastAsia" w:cstheme="majorBidi"/>
@@ -1754,7 +1746,7 @@
             </w:r>
             <w:r>
               <w:fldChar w:fldCharType="begin"/>
-              <w:instrText xml:space="preserve">PAGEREF _Toc5 \h</w:instrText>
+              <w:instrText xml:space="preserve">PAGEREF _Toc7 \h</w:instrText>
               <w:fldChar w:fldCharType="separate"/>
               <w:t xml:space="preserve">4</w:t>
               <w:fldChar w:fldCharType="end"/>
@@ -1780,7 +1772,7 @@
             <w:rPr/>
           </w:pPr>
           <w:r/>
-          <w:hyperlink w:tooltip="#_Toc6" w:anchor="_Toc6" w:history="1">
+          <w:hyperlink w:tooltip="#_Toc8" w:anchor="_Toc8" w:history="1">
             <w:r>
               <w:rPr>
                 <w:rFonts w:asciiTheme="majorHAnsi" w:hAnsiTheme="majorHAnsi" w:eastAsiaTheme="majorEastAsia" w:cstheme="majorBidi"/>
@@ -1822,7 +1814,7 @@
             </w:r>
             <w:r>
               <w:fldChar w:fldCharType="begin"/>
-              <w:instrText xml:space="preserve">PAGEREF _Toc6 \h</w:instrText>
+              <w:instrText xml:space="preserve">PAGEREF _Toc8 \h</w:instrText>
               <w:fldChar w:fldCharType="separate"/>
               <w:t xml:space="preserve">4</w:t>
               <w:fldChar w:fldCharType="end"/>
@@ -1848,7 +1840,7 @@
             <w:rPr/>
           </w:pPr>
           <w:r/>
-          <w:hyperlink w:tooltip="#_Toc7" w:anchor="_Toc7" w:history="1">
+          <w:hyperlink w:tooltip="#_Toc9" w:anchor="_Toc9" w:history="1">
             <w:r>
               <w:rPr>
                 <w:rFonts w:asciiTheme="majorHAnsi" w:hAnsiTheme="majorHAnsi" w:eastAsiaTheme="majorEastAsia" w:cstheme="majorBidi"/>
@@ -1905,7 +1897,7 @@
             </w:r>
             <w:r>
               <w:fldChar w:fldCharType="begin"/>
-              <w:instrText xml:space="preserve">PAGEREF _Toc7 \h</w:instrText>
+              <w:instrText xml:space="preserve">PAGEREF _Toc9 \h</w:instrText>
               <w:fldChar w:fldCharType="separate"/>
               <w:t xml:space="preserve">4</w:t>
               <w:fldChar w:fldCharType="end"/>
@@ -1931,7 +1923,7 @@
             <w:rPr/>
           </w:pPr>
           <w:r/>
-          <w:hyperlink w:tooltip="#_Toc8" w:anchor="_Toc8" w:history="1">
+          <w:hyperlink w:tooltip="#_Toc10" w:anchor="_Toc10" w:history="1">
             <w:r>
               <w:rPr>
                 <w:rFonts w:asciiTheme="majorHAnsi" w:hAnsiTheme="majorHAnsi" w:eastAsiaTheme="majorEastAsia" w:cstheme="majorBidi"/>
@@ -1969,7 +1961,7 @@
             </w:r>
             <w:r>
               <w:fldChar w:fldCharType="begin"/>
-              <w:instrText xml:space="preserve">PAGEREF _Toc8 \h</w:instrText>
+              <w:instrText xml:space="preserve">PAGEREF _Toc10 \h</w:instrText>
               <w:fldChar w:fldCharType="separate"/>
               <w:t xml:space="preserve">5</w:t>
               <w:fldChar w:fldCharType="end"/>
@@ -1994,7 +1986,7 @@
             <w:rPr/>
           </w:pPr>
           <w:r/>
-          <w:hyperlink w:tooltip="#_Toc9" w:anchor="_Toc9" w:history="1">
+          <w:hyperlink w:tooltip="#_Toc11" w:anchor="_Toc11" w:history="1">
             <w:r>
               <w:rPr>
                 <w:rStyle w:val="970"/>
@@ -2025,7 +2017,7 @@
             </w:r>
             <w:r>
               <w:fldChar w:fldCharType="begin"/>
-              <w:instrText xml:space="preserve">PAGEREF _Toc9 \h</w:instrText>
+              <w:instrText xml:space="preserve">PAGEREF _Toc11 \h</w:instrText>
               <w:fldChar w:fldCharType="separate"/>
               <w:t xml:space="preserve">5</w:t>
               <w:fldChar w:fldCharType="end"/>
@@ -2052,7 +2044,7 @@
             </w:rPr>
           </w:pPr>
           <w:r/>
-          <w:hyperlink w:tooltip="#_Toc10" w:anchor="_Toc10" w:history="1">
+          <w:hyperlink w:tooltip="#_Toc12" w:anchor="_Toc12" w:history="1">
             <w:r>
               <w:rPr>
                 <w:rStyle w:val="970"/>
@@ -2077,7 +2069,7 @@
             </w:r>
             <w:r>
               <w:fldChar w:fldCharType="begin"/>
-              <w:instrText xml:space="preserve">PAGEREF _Toc10 \h</w:instrText>
+              <w:instrText xml:space="preserve">PAGEREF _Toc12 \h</w:instrText>
               <w:fldChar w:fldCharType="separate"/>
               <w:t xml:space="preserve">6</w:t>
               <w:fldChar w:fldCharType="end"/>
@@ -2108,7 +2100,7 @@
             <w:rPr/>
           </w:pPr>
           <w:r/>
-          <w:hyperlink w:tooltip="#_Toc11" w:anchor="_Toc11" w:history="1">
+          <w:hyperlink w:tooltip="#_Toc13" w:anchor="_Toc13" w:history="1">
             <w:r>
               <w:rPr>
                 <w:rFonts w:asciiTheme="majorHAnsi" w:hAnsiTheme="majorHAnsi" w:eastAsiaTheme="majorEastAsia" w:cstheme="majorBidi"/>
@@ -2138,115 +2130,6 @@
                 <w:lang w:val="pt-PT"/>
               </w:rPr>
               <w:t xml:space="preserve">ão de Utilizadores</w:t>
-            </w:r>
-            <w:r>
-              <w:rPr>
-                <w:rStyle w:val="970"/>
-                <w:lang w:val="pt-PT"/>
-              </w:rPr>
-            </w:r>
-            <w:r>
-              <w:tab/>
-            </w:r>
-            <w:r>
-              <w:fldChar w:fldCharType="begin"/>
-              <w:instrText xml:space="preserve">PAGEREF _Toc11 \h</w:instrText>
-              <w:fldChar w:fldCharType="separate"/>
-              <w:t xml:space="preserve">6</w:t>
-              <w:fldChar w:fldCharType="end"/>
-            </w:r>
-          </w:hyperlink>
-          <w:r>
-            <w:rPr>
-              <w:lang w:val="pt-PT"/>
-            </w:rPr>
-          </w:r>
-          <w:r/>
-        </w:p>
-        <w:p>
-          <w:pPr>
-            <w:pStyle w:val="999"/>
-            <w:pBdr/>
-            <w:tabs>
-              <w:tab w:val="right" w:leader="dot" w:pos="8494"/>
-            </w:tabs>
-            <w:spacing/>
-            <w:ind/>
-            <w:rPr/>
-          </w:pPr>
-          <w:r/>
-          <w:hyperlink w:tooltip="#_Toc12" w:anchor="_Toc12" w:history="1">
-            <w:r>
-              <w:rPr>
-                <w:rStyle w:val="970"/>
-              </w:rPr>
-            </w:r>
-            <w:r>
-              <w:rPr>
-                <w:rStyle w:val="970"/>
-                <w:lang w:val="pt-PT"/>
-              </w:rPr>
-              <w:t xml:space="preserve">IAM</w:t>
-            </w:r>
-            <w:r>
-              <w:rPr>
-                <w:rStyle w:val="970"/>
-                <w:lang w:val="pt-PT"/>
-              </w:rPr>
-            </w:r>
-            <w:r>
-              <w:tab/>
-            </w:r>
-            <w:r>
-              <w:fldChar w:fldCharType="begin"/>
-              <w:instrText xml:space="preserve">PAGEREF _Toc12 \h</w:instrText>
-              <w:fldChar w:fldCharType="separate"/>
-              <w:t xml:space="preserve">6</w:t>
-              <w:fldChar w:fldCharType="end"/>
-            </w:r>
-          </w:hyperlink>
-          <w:r>
-            <w:rPr>
-              <w:lang w:val="pt-PT"/>
-            </w:rPr>
-          </w:r>
-          <w:r/>
-        </w:p>
-        <w:p>
-          <w:pPr>
-            <w:pStyle w:val="997"/>
-            <w:pBdr/>
-            <w:tabs>
-              <w:tab w:val="left" w:leader="none" w:pos="850"/>
-              <w:tab w:val="right" w:leader="dot" w:pos="8494"/>
-            </w:tabs>
-            <w:spacing/>
-            <w:ind/>
-            <w:rPr/>
-          </w:pPr>
-          <w:r/>
-          <w:hyperlink w:tooltip="#_Toc13" w:anchor="_Toc13" w:history="1">
-            <w:r>
-              <w:rPr>
-                <w:rFonts w:asciiTheme="majorHAnsi" w:hAnsiTheme="majorHAnsi" w:eastAsiaTheme="majorEastAsia" w:cstheme="majorBidi"/>
-              </w:rPr>
-              <w:t xml:space="preserve">2.</w:t>
-            </w:r>
-            <w:r>
-              <w:tab/>
-            </w:r>
-            <w:r>
-              <w:rPr>
-                <w:rStyle w:val="970"/>
-              </w:rPr>
-            </w:r>
-            <w:r>
-              <w:rPr>
-                <w:rStyle w:val="970"/>
-                <w:highlight w:val="none"/>
-                <w:lang w:val="pt-PT"/>
-              </w:rPr>
-              <w:t xml:space="preserve">Processo de Candidatura</w:t>
             </w:r>
             <w:r>
               <w:rPr>
@@ -2293,17 +2176,9 @@
             <w:r>
               <w:rPr>
                 <w:rStyle w:val="970"/>
-                <w:highlight w:val="none"/>
                 <w:lang w:val="pt-PT"/>
               </w:rPr>
-              <w:t xml:space="preserve">Candidaturas</w:t>
-            </w:r>
-            <w:r>
-              <w:rPr>
-                <w:rStyle w:val="970"/>
-                <w:lang w:val="pt-BR"/>
-              </w:rPr>
-              <w:t xml:space="preserve"> Locais</w:t>
+              <w:t xml:space="preserve">IAM</w:t>
             </w:r>
             <w:r>
               <w:rPr>
@@ -2331,9 +2206,10 @@
         </w:p>
         <w:p>
           <w:pPr>
-            <w:pStyle w:val="999"/>
+            <w:pStyle w:val="997"/>
             <w:pBdr/>
             <w:tabs>
+              <w:tab w:val="left" w:leader="none" w:pos="850"/>
               <w:tab w:val="right" w:leader="dot" w:pos="8494"/>
             </w:tabs>
             <w:spacing/>
@@ -2342,6 +2218,15 @@
           </w:pPr>
           <w:r/>
           <w:hyperlink w:tooltip="#_Toc15" w:anchor="_Toc15" w:history="1">
+            <w:r>
+              <w:rPr>
+                <w:rFonts w:asciiTheme="majorHAnsi" w:hAnsiTheme="majorHAnsi" w:eastAsiaTheme="majorEastAsia" w:cstheme="majorBidi"/>
+              </w:rPr>
+              <w:t xml:space="preserve">2.</w:t>
+            </w:r>
+            <w:r>
+              <w:tab/>
+            </w:r>
             <w:r>
               <w:rPr>
                 <w:rStyle w:val="970"/>
@@ -2353,7 +2238,7 @@
                 <w:highlight w:val="none"/>
                 <w:lang w:val="pt-PT"/>
               </w:rPr>
-              <w:t xml:space="preserve">Candidaturas DGES</w:t>
+              <w:t xml:space="preserve">Processo de Candidatura</w:t>
             </w:r>
             <w:r>
               <w:rPr>
@@ -2368,7 +2253,7 @@
               <w:fldChar w:fldCharType="begin"/>
               <w:instrText xml:space="preserve">PAGEREF _Toc15 \h</w:instrText>
               <w:fldChar w:fldCharType="separate"/>
-              <w:t xml:space="preserve">7</w:t>
+              <w:t xml:space="preserve">6</w:t>
               <w:fldChar w:fldCharType="end"/>
             </w:r>
           </w:hyperlink>
@@ -2400,6 +2285,113 @@
             <w:r>
               <w:rPr>
                 <w:rStyle w:val="970"/>
+                <w:highlight w:val="none"/>
+                <w:lang w:val="pt-PT"/>
+              </w:rPr>
+              <w:t xml:space="preserve">Candidaturas</w:t>
+            </w:r>
+            <w:r>
+              <w:rPr>
+                <w:rStyle w:val="970"/>
+                <w:lang w:val="pt-BR"/>
+              </w:rPr>
+              <w:t xml:space="preserve"> Locais</w:t>
+            </w:r>
+            <w:r>
+              <w:rPr>
+                <w:rStyle w:val="970"/>
+                <w:lang w:val="pt-PT"/>
+              </w:rPr>
+            </w:r>
+            <w:r>
+              <w:tab/>
+            </w:r>
+            <w:r>
+              <w:fldChar w:fldCharType="begin"/>
+              <w:instrText xml:space="preserve">PAGEREF _Toc16 \h</w:instrText>
+              <w:fldChar w:fldCharType="separate"/>
+              <w:t xml:space="preserve">6</w:t>
+              <w:fldChar w:fldCharType="end"/>
+            </w:r>
+          </w:hyperlink>
+          <w:r>
+            <w:rPr>
+              <w:lang w:val="pt-PT"/>
+            </w:rPr>
+          </w:r>
+          <w:r/>
+        </w:p>
+        <w:p>
+          <w:pPr>
+            <w:pStyle w:val="999"/>
+            <w:pBdr/>
+            <w:tabs>
+              <w:tab w:val="right" w:leader="dot" w:pos="8494"/>
+            </w:tabs>
+            <w:spacing/>
+            <w:ind/>
+            <w:rPr/>
+          </w:pPr>
+          <w:r/>
+          <w:hyperlink w:tooltip="#_Toc17" w:anchor="_Toc17" w:history="1">
+            <w:r>
+              <w:rPr>
+                <w:rStyle w:val="970"/>
+              </w:rPr>
+            </w:r>
+            <w:r>
+              <w:rPr>
+                <w:rStyle w:val="970"/>
+                <w:highlight w:val="none"/>
+                <w:lang w:val="pt-PT"/>
+              </w:rPr>
+              <w:t xml:space="preserve">Candidaturas DGES</w:t>
+            </w:r>
+            <w:r>
+              <w:rPr>
+                <w:rStyle w:val="970"/>
+                <w:lang w:val="pt-PT"/>
+              </w:rPr>
+            </w:r>
+            <w:r>
+              <w:tab/>
+            </w:r>
+            <w:r>
+              <w:fldChar w:fldCharType="begin"/>
+              <w:instrText xml:space="preserve">PAGEREF _Toc17 \h</w:instrText>
+              <w:fldChar w:fldCharType="separate"/>
+              <w:t xml:space="preserve">7</w:t>
+              <w:fldChar w:fldCharType="end"/>
+            </w:r>
+          </w:hyperlink>
+          <w:r>
+            <w:rPr>
+              <w:lang w:val="pt-PT"/>
+            </w:rPr>
+          </w:r>
+          <w:r/>
+        </w:p>
+        <w:p>
+          <w:pPr>
+            <w:pStyle w:val="999"/>
+            <w:pBdr/>
+            <w:tabs>
+              <w:tab w:val="right" w:leader="dot" w:pos="8494"/>
+            </w:tabs>
+            <w:spacing/>
+            <w:ind/>
+            <w:rPr/>
+          </w:pPr>
+          <w:r/>
+          <w:hyperlink w:tooltip="#_Toc18" w:anchor="_Toc18" w:history="1">
+            <w:r>
+              <w:rPr>
+                <w:rStyle w:val="970"/>
+              </w:rPr>
+            </w:r>
+            <w:r>
+              <w:rPr>
+                <w:rStyle w:val="970"/>
                 <w:lang w:val="pt-PT"/>
               </w:rPr>
               <w:t xml:space="preserve">Matr</w:t>
@@ -2422,7 +2414,7 @@
             </w:r>
             <w:r>
               <w:fldChar w:fldCharType="begin"/>
-              <w:instrText xml:space="preserve">PAGEREF _Toc16 \h</w:instrText>
+              <w:instrText xml:space="preserve">PAGEREF _Toc18 \h</w:instrText>
               <w:fldChar w:fldCharType="separate"/>
               <w:t xml:space="preserve">8</w:t>
               <w:fldChar w:fldCharType="end"/>
@@ -2448,7 +2440,7 @@
             <w:rPr/>
           </w:pPr>
           <w:r/>
-          <w:hyperlink w:tooltip="#_Toc17" w:anchor="_Toc17" w:history="1">
+          <w:hyperlink w:tooltip="#_Toc19" w:anchor="_Toc19" w:history="1">
             <w:r>
               <w:rPr>
                 <w:rFonts w:asciiTheme="majorHAnsi" w:hAnsiTheme="majorHAnsi" w:eastAsiaTheme="majorEastAsia" w:cstheme="majorBidi"/>
@@ -2495,114 +2487,9 @@
             </w:r>
             <w:r>
               <w:fldChar w:fldCharType="begin"/>
-              <w:instrText xml:space="preserve">PAGEREF _Toc17 \h</w:instrText>
+              <w:instrText xml:space="preserve">PAGEREF _Toc19 \h</w:instrText>
               <w:fldChar w:fldCharType="separate"/>
               <w:t xml:space="preserve">9</w:t>
-              <w:fldChar w:fldCharType="end"/>
-            </w:r>
-          </w:hyperlink>
-          <w:r>
-            <w:rPr>
-              <w:lang w:val="pt-PT"/>
-            </w:rPr>
-          </w:r>
-          <w:r/>
-        </w:p>
-        <w:p>
-          <w:pPr>
-            <w:pStyle w:val="999"/>
-            <w:pBdr/>
-            <w:tabs>
-              <w:tab w:val="right" w:leader="dot" w:pos="8494"/>
-            </w:tabs>
-            <w:spacing/>
-            <w:ind/>
-            <w:rPr/>
-          </w:pPr>
-          <w:r/>
-          <w:hyperlink w:tooltip="#_Toc18" w:anchor="_Toc18" w:history="1">
-            <w:r>
-              <w:rPr>
-                <w:rStyle w:val="970"/>
-              </w:rPr>
-            </w:r>
-            <w:r>
-              <w:rPr>
-                <w:rStyle w:val="970"/>
-                <w:lang w:val="pt-PT"/>
-              </w:rPr>
-              <w:t xml:space="preserve">Avaliaç</w:t>
-            </w:r>
-            <w:r>
-              <w:rPr>
-                <w:rStyle w:val="970"/>
-                <w:lang w:val="pt-PT"/>
-              </w:rPr>
-              <w:t xml:space="preserve">ões</w:t>
-            </w:r>
-            <w:r>
-              <w:rPr>
-                <w:rStyle w:val="970"/>
-                <w:lang w:val="pt-PT"/>
-              </w:rPr>
-            </w:r>
-            <w:r>
-              <w:tab/>
-            </w:r>
-            <w:r>
-              <w:fldChar w:fldCharType="begin"/>
-              <w:instrText xml:space="preserve">PAGEREF _Toc18 \h</w:instrText>
-              <w:fldChar w:fldCharType="separate"/>
-              <w:t xml:space="preserve">9</w:t>
-              <w:fldChar w:fldCharType="end"/>
-            </w:r>
-          </w:hyperlink>
-          <w:r>
-            <w:rPr>
-              <w:lang w:val="pt-PT"/>
-            </w:rPr>
-          </w:r>
-          <w:r/>
-        </w:p>
-        <w:p>
-          <w:pPr>
-            <w:pStyle w:val="999"/>
-            <w:pBdr/>
-            <w:tabs>
-              <w:tab w:val="right" w:leader="dot" w:pos="8494"/>
-            </w:tabs>
-            <w:spacing/>
-            <w:ind/>
-            <w:rPr/>
-          </w:pPr>
-          <w:r/>
-          <w:hyperlink w:tooltip="#_Toc19" w:anchor="_Toc19" w:history="1">
-            <w:r>
-              <w:rPr>
-                <w:rStyle w:val="970"/>
-              </w:rPr>
-            </w:r>
-            <w:r>
-              <w:rPr>
-                <w:rStyle w:val="970"/>
-                <w:lang w:val="pt-PT"/>
-              </w:rPr>
-              <w:t xml:space="preserve">Pautas</w:t>
-            </w:r>
-            <w:r>
-              <w:rPr>
-                <w:rStyle w:val="970"/>
-                <w:lang w:val="pt-PT"/>
-              </w:rPr>
-            </w:r>
-            <w:r>
-              <w:tab/>
-            </w:r>
-            <w:r>
-              <w:fldChar w:fldCharType="begin"/>
-              <w:instrText xml:space="preserve">PAGEREF _Toc19 \h</w:instrText>
-              <w:fldChar w:fldCharType="separate"/>
-              <w:t xml:space="preserve">10</w:t>
               <w:fldChar w:fldCharType="end"/>
             </w:r>
           </w:hyperlink>
@@ -2636,6 +2523,111 @@
                 <w:rStyle w:val="970"/>
                 <w:lang w:val="pt-PT"/>
               </w:rPr>
+              <w:t xml:space="preserve">Avaliaç</w:t>
+            </w:r>
+            <w:r>
+              <w:rPr>
+                <w:rStyle w:val="970"/>
+                <w:lang w:val="pt-PT"/>
+              </w:rPr>
+              <w:t xml:space="preserve">ões</w:t>
+            </w:r>
+            <w:r>
+              <w:rPr>
+                <w:rStyle w:val="970"/>
+                <w:lang w:val="pt-PT"/>
+              </w:rPr>
+            </w:r>
+            <w:r>
+              <w:tab/>
+            </w:r>
+            <w:r>
+              <w:fldChar w:fldCharType="begin"/>
+              <w:instrText xml:space="preserve">PAGEREF _Toc20 \h</w:instrText>
+              <w:fldChar w:fldCharType="separate"/>
+              <w:t xml:space="preserve">9</w:t>
+              <w:fldChar w:fldCharType="end"/>
+            </w:r>
+          </w:hyperlink>
+          <w:r>
+            <w:rPr>
+              <w:lang w:val="pt-PT"/>
+            </w:rPr>
+          </w:r>
+          <w:r/>
+        </w:p>
+        <w:p>
+          <w:pPr>
+            <w:pStyle w:val="999"/>
+            <w:pBdr/>
+            <w:tabs>
+              <w:tab w:val="right" w:leader="dot" w:pos="8494"/>
+            </w:tabs>
+            <w:spacing/>
+            <w:ind/>
+            <w:rPr/>
+          </w:pPr>
+          <w:r/>
+          <w:hyperlink w:tooltip="#_Toc21" w:anchor="_Toc21" w:history="1">
+            <w:r>
+              <w:rPr>
+                <w:rStyle w:val="970"/>
+              </w:rPr>
+            </w:r>
+            <w:r>
+              <w:rPr>
+                <w:rStyle w:val="970"/>
+                <w:lang w:val="pt-PT"/>
+              </w:rPr>
+              <w:t xml:space="preserve">Pautas</w:t>
+            </w:r>
+            <w:r>
+              <w:rPr>
+                <w:rStyle w:val="970"/>
+                <w:lang w:val="pt-PT"/>
+              </w:rPr>
+            </w:r>
+            <w:r>
+              <w:tab/>
+            </w:r>
+            <w:r>
+              <w:fldChar w:fldCharType="begin"/>
+              <w:instrText xml:space="preserve">PAGEREF _Toc21 \h</w:instrText>
+              <w:fldChar w:fldCharType="separate"/>
+              <w:t xml:space="preserve">10</w:t>
+              <w:fldChar w:fldCharType="end"/>
+            </w:r>
+          </w:hyperlink>
+          <w:r>
+            <w:rPr>
+              <w:lang w:val="pt-PT"/>
+            </w:rPr>
+          </w:r>
+          <w:r/>
+        </w:p>
+        <w:p>
+          <w:pPr>
+            <w:pStyle w:val="999"/>
+            <w:pBdr/>
+            <w:tabs>
+              <w:tab w:val="right" w:leader="dot" w:pos="8494"/>
+            </w:tabs>
+            <w:spacing/>
+            <w:ind/>
+            <w:rPr/>
+          </w:pPr>
+          <w:r/>
+          <w:hyperlink w:tooltip="#_Toc22" w:anchor="_Toc22" w:history="1">
+            <w:r>
+              <w:rPr>
+                <w:rStyle w:val="970"/>
+              </w:rPr>
+            </w:r>
+            <w:r>
+              <w:rPr>
+                <w:rStyle w:val="970"/>
+                <w:lang w:val="pt-PT"/>
+              </w:rPr>
               <w:t xml:space="preserve">Hor</w:t>
             </w:r>
             <w:r>
@@ -2656,7 +2648,7 @@
             </w:r>
             <w:r>
               <w:fldChar w:fldCharType="begin"/>
-              <w:instrText xml:space="preserve">PAGEREF _Toc20 \h</w:instrText>
+              <w:instrText xml:space="preserve">PAGEREF _Toc22 \h</w:instrText>
               <w:fldChar w:fldCharType="separate"/>
               <w:t xml:space="preserve">11</w:t>
               <w:fldChar w:fldCharType="end"/>
@@ -2681,7 +2673,7 @@
             <w:rPr/>
           </w:pPr>
           <w:r/>
-          <w:hyperlink w:tooltip="#_Toc21" w:anchor="_Toc21" w:history="1">
+          <w:hyperlink w:tooltip="#_Toc23" w:anchor="_Toc23" w:history="1">
             <w:r>
               <w:rPr>
                 <w:rStyle w:val="970"/>
@@ -2719,7 +2711,7 @@
             </w:r>
             <w:r>
               <w:fldChar w:fldCharType="begin"/>
-              <w:instrText xml:space="preserve">PAGEREF _Toc21 \h</w:instrText>
+              <w:instrText xml:space="preserve">PAGEREF _Toc23 \h</w:instrText>
               <w:fldChar w:fldCharType="separate"/>
               <w:t xml:space="preserve">12</w:t>
               <w:fldChar w:fldCharType="end"/>
@@ -2745,7 +2737,7 @@
             <w:rPr/>
           </w:pPr>
           <w:r/>
-          <w:hyperlink w:tooltip="#_Toc22" w:anchor="_Toc22" w:history="1">
+          <w:hyperlink w:tooltip="#_Toc24" w:anchor="_Toc24" w:history="1">
             <w:r>
               <w:rPr>
                 <w:rFonts w:asciiTheme="majorHAnsi" w:hAnsiTheme="majorHAnsi" w:eastAsiaTheme="majorEastAsia" w:cstheme="majorBidi"/>
@@ -2799,7 +2791,7 @@
             </w:r>
             <w:r>
               <w:fldChar w:fldCharType="begin"/>
-              <w:instrText xml:space="preserve">PAGEREF _Toc22 \h</w:instrText>
+              <w:instrText xml:space="preserve">PAGEREF _Toc24 \h</w:instrText>
               <w:fldChar w:fldCharType="separate"/>
               <w:t xml:space="preserve">13</w:t>
               <w:fldChar w:fldCharType="end"/>
@@ -2824,7 +2816,7 @@
             <w:rPr/>
           </w:pPr>
           <w:r/>
-          <w:hyperlink w:tooltip="#_Toc23" w:anchor="_Toc23" w:history="1">
+          <w:hyperlink w:tooltip="#_Toc25" w:anchor="_Toc25" w:history="1">
             <w:r>
               <w:rPr>
                 <w:rStyle w:val="970"/>
@@ -2862,7 +2854,7 @@
             </w:r>
             <w:r>
               <w:fldChar w:fldCharType="begin"/>
-              <w:instrText xml:space="preserve">PAGEREF _Toc23 \h</w:instrText>
+              <w:instrText xml:space="preserve">PAGEREF _Toc25 \h</w:instrText>
               <w:fldChar w:fldCharType="separate"/>
               <w:t xml:space="preserve">13</w:t>
               <w:fldChar w:fldCharType="end"/>
@@ -2887,7 +2879,7 @@
             <w:rPr/>
           </w:pPr>
           <w:r/>
-          <w:hyperlink w:tooltip="#_Toc24" w:anchor="_Toc24" w:history="1">
+          <w:hyperlink w:tooltip="#_Toc26" w:anchor="_Toc26" w:history="1">
             <w:r>
               <w:rPr>
                 <w:rStyle w:val="970"/>
@@ -2918,7 +2910,7 @@
             </w:r>
             <w:r>
               <w:fldChar w:fldCharType="begin"/>
-              <w:instrText xml:space="preserve">PAGEREF _Toc24 \h</w:instrText>
+              <w:instrText xml:space="preserve">PAGEREF _Toc26 \h</w:instrText>
               <w:fldChar w:fldCharType="separate"/>
               <w:t xml:space="preserve">14</w:t>
               <w:fldChar w:fldCharType="end"/>
@@ -2943,7 +2935,7 @@
             <w:rPr/>
           </w:pPr>
           <w:r/>
-          <w:hyperlink w:tooltip="#_Toc25" w:anchor="_Toc25" w:history="1">
+          <w:hyperlink w:tooltip="#_Toc27" w:anchor="_Toc27" w:history="1">
             <w:r>
               <w:rPr>
                 <w:rStyle w:val="970"/>
@@ -2974,7 +2966,7 @@
             </w:r>
             <w:r>
               <w:fldChar w:fldCharType="begin"/>
-              <w:instrText xml:space="preserve">PAGEREF _Toc25 \h</w:instrText>
+              <w:instrText xml:space="preserve">PAGEREF _Toc27 \h</w:instrText>
               <w:fldChar w:fldCharType="separate"/>
               <w:t xml:space="preserve">15</w:t>
               <w:fldChar w:fldCharType="end"/>
@@ -3001,7 +2993,7 @@
             </w:rPr>
           </w:pPr>
           <w:r/>
-          <w:hyperlink w:tooltip="#_Toc26" w:anchor="_Toc26" w:history="1">
+          <w:hyperlink w:tooltip="#_Toc28" w:anchor="_Toc28" w:history="1">
             <w:r>
               <w:rPr>
                 <w:rStyle w:val="970"/>
@@ -3035,7 +3027,7 @@
             </w:r>
             <w:r>
               <w:fldChar w:fldCharType="begin"/>
-              <w:instrText xml:space="preserve">PAGEREF _Toc26 \h</w:instrText>
+              <w:instrText xml:space="preserve">PAGEREF _Toc28 \h</w:instrText>
               <w:fldChar w:fldCharType="separate"/>
               <w:t xml:space="preserve">17</w:t>
               <w:fldChar w:fldCharType="end"/>
@@ -3065,7 +3057,7 @@
             <w:rPr/>
           </w:pPr>
           <w:r/>
-          <w:hyperlink w:tooltip="#_Toc27" w:anchor="_Toc27" w:history="1">
+          <w:hyperlink w:tooltip="#_Toc29" w:anchor="_Toc29" w:history="1">
             <w:r>
               <w:rPr>
                 <w:rStyle w:val="970"/>
@@ -3084,118 +3076,6 @@
                 <w:lang w:val="pt-BR"/>
               </w:rPr>
               <w:t xml:space="preserve">ão</w:t>
-            </w:r>
-            <w:r>
-              <w:rPr>
-                <w:rStyle w:val="970"/>
-                <w:lang w:val="pt-PT"/>
-              </w:rPr>
-            </w:r>
-            <w:r>
-              <w:tab/>
-            </w:r>
-            <w:r>
-              <w:fldChar w:fldCharType="begin"/>
-              <w:instrText xml:space="preserve">PAGEREF _Toc27 \h</w:instrText>
-              <w:fldChar w:fldCharType="separate"/>
-              <w:t xml:space="preserve">17</w:t>
-              <w:fldChar w:fldCharType="end"/>
-            </w:r>
-          </w:hyperlink>
-          <w:r>
-            <w:rPr>
-              <w:lang w:val="pt-PT"/>
-            </w:rPr>
-          </w:r>
-          <w:r/>
-        </w:p>
-        <w:p>
-          <w:pPr>
-            <w:pStyle w:val="997"/>
-            <w:pBdr/>
-            <w:tabs>
-              <w:tab w:val="right" w:leader="dot" w:pos="8494"/>
-            </w:tabs>
-            <w:spacing/>
-            <w:ind/>
-            <w:rPr/>
-          </w:pPr>
-          <w:r/>
-          <w:hyperlink w:tooltip="#_Toc28" w:anchor="_Toc28" w:history="1">
-            <w:r>
-              <w:rPr>
-                <w:rStyle w:val="970"/>
-              </w:rPr>
-            </w:r>
-            <w:r>
-              <w:rPr>
-                <w:rStyle w:val="970"/>
-                <w:lang w:val="pt-BR"/>
-              </w:rPr>
-              <w:t xml:space="preserve">Lançamento de Classificaç</w:t>
-            </w:r>
-            <w:r>
-              <w:rPr>
-                <w:rStyle w:val="970"/>
-                <w:lang w:val="pt-BR"/>
-              </w:rPr>
-              <w:t xml:space="preserve">ões</w:t>
-            </w:r>
-            <w:r>
-              <w:rPr>
-                <w:rStyle w:val="970"/>
-                <w:lang w:val="pt-PT"/>
-              </w:rPr>
-            </w:r>
-            <w:r>
-              <w:tab/>
-            </w:r>
-            <w:r>
-              <w:fldChar w:fldCharType="begin"/>
-              <w:instrText xml:space="preserve">PAGEREF _Toc28 \h</w:instrText>
-              <w:fldChar w:fldCharType="separate"/>
-              <w:t xml:space="preserve">17</w:t>
-              <w:fldChar w:fldCharType="end"/>
-            </w:r>
-          </w:hyperlink>
-          <w:r>
-            <w:rPr>
-              <w:lang w:val="pt-PT"/>
-            </w:rPr>
-          </w:r>
-          <w:r/>
-        </w:p>
-        <w:p>
-          <w:pPr>
-            <w:pStyle w:val="997"/>
-            <w:pBdr/>
-            <w:tabs>
-              <w:tab w:val="right" w:leader="dot" w:pos="8494"/>
-            </w:tabs>
-            <w:spacing/>
-            <w:ind/>
-            <w:rPr/>
-          </w:pPr>
-          <w:r/>
-          <w:hyperlink w:tooltip="#_Toc29" w:anchor="_Toc29" w:history="1">
-            <w:r>
-              <w:rPr>
-                <w:rStyle w:val="970"/>
-              </w:rPr>
-            </w:r>
-            <w:r>
-              <w:rPr>
-                <w:rStyle w:val="970"/>
-                <w:lang w:val="pt-BR"/>
-              </w:rPr>
-              <w:t xml:space="preserve">Publicaç</w:t>
-            </w:r>
-            <w:r>
-              <w:rPr>
-                <w:rStyle w:val="970"/>
-                <w:lang w:val="pt-BR"/>
-              </w:rPr>
-              <w:t xml:space="preserve">ão de Pautas</w:t>
             </w:r>
             <w:r>
               <w:rPr>
@@ -3244,12 +3124,19 @@
                 <w:rStyle w:val="970"/>
                 <w:lang w:val="pt-BR"/>
               </w:rPr>
-              <w:t xml:space="preserve">Candidatura Submetida</w:t>
+              <w:t xml:space="preserve">Lançamento de Classificaç</w:t>
             </w:r>
             <w:r>
               <w:rPr>
                 <w:rStyle w:val="970"/>
                 <w:lang w:val="pt-BR"/>
+              </w:rPr>
+              <w:t xml:space="preserve">ões</w:t>
+            </w:r>
+            <w:r>
+              <w:rPr>
+                <w:rStyle w:val="970"/>
+                <w:lang w:val="pt-PT"/>
               </w:rPr>
             </w:r>
             <w:r>
@@ -3259,13 +3146,13 @@
               <w:fldChar w:fldCharType="begin"/>
               <w:instrText xml:space="preserve">PAGEREF _Toc30 \h</w:instrText>
               <w:fldChar w:fldCharType="separate"/>
-              <w:t xml:space="preserve">18</w:t>
+              <w:t xml:space="preserve">17</w:t>
               <w:fldChar w:fldCharType="end"/>
             </w:r>
           </w:hyperlink>
           <w:r>
             <w:rPr>
-              <w:lang w:val="pt-BR"/>
+              <w:lang w:val="pt-PT"/>
             </w:rPr>
           </w:r>
           <w:r/>
@@ -3293,7 +3180,63 @@
                 <w:rStyle w:val="970"/>
                 <w:lang w:val="pt-BR"/>
               </w:rPr>
-              <w:t xml:space="preserve">Processamento de Candidaturas</w:t>
+              <w:t xml:space="preserve">Publicaç</w:t>
+            </w:r>
+            <w:r>
+              <w:rPr>
+                <w:rStyle w:val="970"/>
+                <w:lang w:val="pt-BR"/>
+              </w:rPr>
+              <w:t xml:space="preserve">ão de Pautas</w:t>
+            </w:r>
+            <w:r>
+              <w:rPr>
+                <w:rStyle w:val="970"/>
+                <w:lang w:val="pt-PT"/>
+              </w:rPr>
+            </w:r>
+            <w:r>
+              <w:tab/>
+            </w:r>
+            <w:r>
+              <w:fldChar w:fldCharType="begin"/>
+              <w:instrText xml:space="preserve">PAGEREF _Toc31 \h</w:instrText>
+              <w:fldChar w:fldCharType="separate"/>
+              <w:t xml:space="preserve">17</w:t>
+              <w:fldChar w:fldCharType="end"/>
+            </w:r>
+          </w:hyperlink>
+          <w:r>
+            <w:rPr>
+              <w:lang w:val="pt-PT"/>
+            </w:rPr>
+          </w:r>
+          <w:r/>
+        </w:p>
+        <w:p>
+          <w:pPr>
+            <w:pStyle w:val="997"/>
+            <w:pBdr/>
+            <w:tabs>
+              <w:tab w:val="right" w:leader="dot" w:pos="8494"/>
+            </w:tabs>
+            <w:spacing/>
+            <w:ind/>
+            <w:rPr/>
+          </w:pPr>
+          <w:r/>
+          <w:hyperlink w:tooltip="#_Toc32" w:anchor="_Toc32" w:history="1">
+            <w:r>
+              <w:rPr>
+                <w:rStyle w:val="970"/>
+              </w:rPr>
+            </w:r>
+            <w:r>
+              <w:rPr>
+                <w:rStyle w:val="970"/>
+                <w:lang w:val="pt-BR"/>
+              </w:rPr>
+              <w:t xml:space="preserve">Candidatura Submetida</w:t>
             </w:r>
             <w:r>
               <w:rPr>
@@ -3306,7 +3249,7 @@
             </w:r>
             <w:r>
               <w:fldChar w:fldCharType="begin"/>
-              <w:instrText xml:space="preserve">PAGEREF _Toc31 \h</w:instrText>
+              <w:instrText xml:space="preserve">PAGEREF _Toc32 \h</w:instrText>
               <w:fldChar w:fldCharType="separate"/>
               <w:t xml:space="preserve">18</w:t>
               <w:fldChar w:fldCharType="end"/>
@@ -3331,7 +3274,56 @@
             <w:rPr/>
           </w:pPr>
           <w:r/>
-          <w:hyperlink w:tooltip="#_Toc32" w:anchor="_Toc32" w:history="1">
+          <w:hyperlink w:tooltip="#_Toc33" w:anchor="_Toc33" w:history="1">
+            <w:r>
+              <w:rPr>
+                <w:rStyle w:val="970"/>
+              </w:rPr>
+            </w:r>
+            <w:r>
+              <w:rPr>
+                <w:rStyle w:val="970"/>
+                <w:lang w:val="pt-BR"/>
+              </w:rPr>
+              <w:t xml:space="preserve">Processamento de Candidaturas</w:t>
+            </w:r>
+            <w:r>
+              <w:rPr>
+                <w:rStyle w:val="970"/>
+                <w:lang w:val="pt-BR"/>
+              </w:rPr>
+            </w:r>
+            <w:r>
+              <w:tab/>
+            </w:r>
+            <w:r>
+              <w:fldChar w:fldCharType="begin"/>
+              <w:instrText xml:space="preserve">PAGEREF _Toc33 \h</w:instrText>
+              <w:fldChar w:fldCharType="separate"/>
+              <w:t xml:space="preserve">18</w:t>
+              <w:fldChar w:fldCharType="end"/>
+            </w:r>
+          </w:hyperlink>
+          <w:r>
+            <w:rPr>
+              <w:lang w:val="pt-BR"/>
+            </w:rPr>
+          </w:r>
+          <w:r/>
+        </w:p>
+        <w:p>
+          <w:pPr>
+            <w:pStyle w:val="997"/>
+            <w:pBdr/>
+            <w:tabs>
+              <w:tab w:val="right" w:leader="dot" w:pos="8494"/>
+            </w:tabs>
+            <w:spacing/>
+            <w:ind/>
+            <w:rPr/>
+          </w:pPr>
+          <w:r/>
+          <w:hyperlink w:tooltip="#_Toc34" w:anchor="_Toc34" w:history="1">
             <w:r>
               <w:rPr>
                 <w:rStyle w:val="970"/>
@@ -3362,7 +3354,7 @@
             </w:r>
             <w:r>
               <w:fldChar w:fldCharType="begin"/>
-              <w:instrText xml:space="preserve">PAGEREF _Toc32 \h</w:instrText>
+              <w:instrText xml:space="preserve">PAGEREF _Toc34 \h</w:instrText>
               <w:fldChar w:fldCharType="separate"/>
               <w:t xml:space="preserve">18</w:t>
               <w:fldChar w:fldCharType="end"/>
@@ -3387,7 +3379,7 @@
             <w:rPr/>
           </w:pPr>
           <w:r/>
-          <w:hyperlink w:tooltip="#_Toc33" w:anchor="_Toc33" w:history="1">
+          <w:hyperlink w:tooltip="#_Toc35" w:anchor="_Toc35" w:history="1">
             <w:r>
               <w:rPr>
                 <w:rStyle w:val="970"/>
@@ -3420,7 +3412,7 @@
             </w:r>
             <w:r>
               <w:fldChar w:fldCharType="begin"/>
-              <w:instrText xml:space="preserve">PAGEREF _Toc33 \h</w:instrText>
+              <w:instrText xml:space="preserve">PAGEREF _Toc35 \h</w:instrText>
               <w:fldChar w:fldCharType="separate"/>
               <w:t xml:space="preserve">19</w:t>
               <w:fldChar w:fldCharType="end"/>
@@ -3447,7 +3439,7 @@
             </w:rPr>
           </w:pPr>
           <w:r/>
-          <w:hyperlink w:tooltip="#_Toc34" w:anchor="_Toc34" w:history="1">
+          <w:hyperlink w:tooltip="#_Toc36" w:anchor="_Toc36" w:history="1">
             <w:r>
               <w:rPr>
                 <w:rStyle w:val="970"/>
@@ -3473,7 +3465,7 @@
             </w:r>
             <w:r>
               <w:fldChar w:fldCharType="begin"/>
-              <w:instrText xml:space="preserve">PAGEREF _Toc34 \h</w:instrText>
+              <w:instrText xml:space="preserve">PAGEREF _Toc36 \h</w:instrText>
               <w:fldChar w:fldCharType="separate"/>
               <w:t xml:space="preserve">20</w:t>
               <w:fldChar w:fldCharType="end"/>
@@ -3503,7 +3495,7 @@
             <w:rPr/>
           </w:pPr>
           <w:r/>
-          <w:hyperlink w:tooltip="#_Toc35" w:anchor="_Toc35" w:history="1">
+          <w:hyperlink w:tooltip="#_Toc37" w:anchor="_Toc37" w:history="1">
             <w:r>
               <w:rPr>
                 <w:rStyle w:val="970"/>
@@ -3528,7 +3520,7 @@
             </w:r>
             <w:r>
               <w:fldChar w:fldCharType="begin"/>
-              <w:instrText xml:space="preserve">PAGEREF _Toc35 \h</w:instrText>
+              <w:instrText xml:space="preserve">PAGEREF _Toc37 \h</w:instrText>
               <w:fldChar w:fldCharType="separate"/>
               <w:t xml:space="preserve">20</w:t>
               <w:fldChar w:fldCharType="end"/>
@@ -3555,7 +3547,7 @@
             </w:rPr>
           </w:pPr>
           <w:r/>
-          <w:hyperlink w:tooltip="#_Toc36" w:anchor="_Toc36" w:history="1">
+          <w:hyperlink w:tooltip="#_Toc38" w:anchor="_Toc38" w:history="1">
             <w:r>
               <w:rPr>
                 <w:rStyle w:val="970"/>
@@ -3580,7 +3572,7 @@
             </w:r>
             <w:r>
               <w:fldChar w:fldCharType="begin"/>
-              <w:instrText xml:space="preserve">PAGEREF _Toc36 \h</w:instrText>
+              <w:instrText xml:space="preserve">PAGEREF _Toc38 \h</w:instrText>
               <w:fldChar w:fldCharType="separate"/>
               <w:t xml:space="preserve">21</w:t>
               <w:fldChar w:fldCharType="end"/>
@@ -3610,7 +3602,7 @@
             <w:rPr/>
           </w:pPr>
           <w:r/>
-          <w:hyperlink w:tooltip="#_Toc37" w:anchor="_Toc37" w:history="1">
+          <w:hyperlink w:tooltip="#_Toc39" w:anchor="_Toc39" w:history="1">
             <w:r>
               <w:rPr>
                 <w:rStyle w:val="970"/>
@@ -3641,7 +3633,7 @@
             </w:r>
             <w:r>
               <w:fldChar w:fldCharType="begin"/>
-              <w:instrText xml:space="preserve">PAGEREF _Toc37 \h</w:instrText>
+              <w:instrText xml:space="preserve">PAGEREF _Toc39 \h</w:instrText>
               <w:fldChar w:fldCharType="separate"/>
               <w:t xml:space="preserve">21</w:t>
               <w:fldChar w:fldCharType="end"/>
@@ -3666,7 +3658,7 @@
             <w:rPr/>
           </w:pPr>
           <w:r/>
-          <w:hyperlink w:tooltip="#_Toc38" w:anchor="_Toc38" w:history="1">
+          <w:hyperlink w:tooltip="#_Toc40" w:anchor="_Toc40" w:history="1">
             <w:r>
               <w:rPr>
                 <w:rStyle w:val="970"/>
@@ -3700,101 +3692,9 @@
             </w:r>
             <w:r>
               <w:fldChar w:fldCharType="begin"/>
-              <w:instrText xml:space="preserve">PAGEREF _Toc38 \h</w:instrText>
+              <w:instrText xml:space="preserve">PAGEREF _Toc40 \h</w:instrText>
               <w:fldChar w:fldCharType="separate"/>
               <w:t xml:space="preserve">21</w:t>
-              <w:fldChar w:fldCharType="end"/>
-            </w:r>
-          </w:hyperlink>
-          <w:r/>
-          <w:r/>
-        </w:p>
-        <w:p>
-          <w:pPr>
-            <w:pStyle w:val="997"/>
-            <w:pBdr/>
-            <w:tabs>
-              <w:tab w:val="right" w:leader="dot" w:pos="8494"/>
-            </w:tabs>
-            <w:spacing/>
-            <w:ind/>
-            <w:rPr/>
-          </w:pPr>
-          <w:r/>
-          <w:hyperlink w:tooltip="#_Toc39" w:anchor="_Toc39" w:history="1">
-            <w:r>
-              <w:rPr>
-                <w:rStyle w:val="970"/>
-              </w:rPr>
-            </w:r>
-            <w:r>
-              <w:rPr>
-                <w:rStyle w:val="970"/>
-              </w:rPr>
-              <w:t xml:space="preserve">Pautas</w:t>
-            </w:r>
-            <w:r>
-              <w:rPr>
-                <w:rStyle w:val="970"/>
-              </w:rPr>
-            </w:r>
-            <w:r>
-              <w:tab/>
-            </w:r>
-            <w:r>
-              <w:fldChar w:fldCharType="begin"/>
-              <w:instrText xml:space="preserve">PAGEREF _Toc39 \h</w:instrText>
-              <w:fldChar w:fldCharType="separate"/>
-              <w:t xml:space="preserve">21</w:t>
-              <w:fldChar w:fldCharType="end"/>
-            </w:r>
-          </w:hyperlink>
-          <w:r/>
-          <w:r/>
-        </w:p>
-        <w:p>
-          <w:pPr>
-            <w:pStyle w:val="997"/>
-            <w:pBdr/>
-            <w:tabs>
-              <w:tab w:val="right" w:leader="dot" w:pos="8494"/>
-            </w:tabs>
-            <w:spacing/>
-            <w:ind/>
-            <w:rPr/>
-          </w:pPr>
-          <w:r/>
-          <w:hyperlink w:tooltip="#_Toc40" w:anchor="_Toc40" w:history="1">
-            <w:r>
-              <w:rPr>
-                <w:rStyle w:val="970"/>
-              </w:rPr>
-            </w:r>
-            <w:r>
-              <w:rPr>
-                <w:rStyle w:val="970"/>
-              </w:rPr>
-              <w:t xml:space="preserve">Revis</w:t>
-            </w:r>
-            <w:r>
-              <w:rPr>
-                <w:rStyle w:val="970"/>
-              </w:rPr>
-              <w:t xml:space="preserve">ões</w:t>
-            </w:r>
-            <w:r>
-              <w:rPr>
-                <w:rStyle w:val="970"/>
-              </w:rPr>
-            </w:r>
-            <w:r>
-              <w:tab/>
-            </w:r>
-            <w:r>
-              <w:fldChar w:fldCharType="begin"/>
-              <w:instrText xml:space="preserve">PAGEREF _Toc40 \h</w:instrText>
-              <w:fldChar w:fldCharType="separate"/>
-              <w:t xml:space="preserve">22</w:t>
               <w:fldChar w:fldCharType="end"/>
             </w:r>
           </w:hyperlink>
@@ -3823,7 +3723,7 @@
               <w:rPr>
                 <w:rStyle w:val="970"/>
               </w:rPr>
-              <w:t xml:space="preserve">Candidaturas DGES</w:t>
+              <w:t xml:space="preserve">Pautas</w:t>
             </w:r>
             <w:r>
               <w:rPr>
@@ -3837,7 +3737,7 @@
               <w:fldChar w:fldCharType="begin"/>
               <w:instrText xml:space="preserve">PAGEREF _Toc41 \h</w:instrText>
               <w:fldChar w:fldCharType="separate"/>
-              <w:t xml:space="preserve">22</w:t>
+              <w:t xml:space="preserve">21</w:t>
               <w:fldChar w:fldCharType="end"/>
             </w:r>
           </w:hyperlink>
@@ -3866,7 +3766,13 @@
               <w:rPr>
                 <w:rStyle w:val="970"/>
               </w:rPr>
-              <w:t xml:space="preserve">Candidaturas Locais</w:t>
+              <w:t xml:space="preserve">Revis</w:t>
+            </w:r>
+            <w:r>
+              <w:rPr>
+                <w:rStyle w:val="970"/>
+              </w:rPr>
+              <w:t xml:space="preserve">ões</w:t>
             </w:r>
             <w:r>
               <w:rPr>
@@ -3880,7 +3786,7 @@
               <w:fldChar w:fldCharType="begin"/>
               <w:instrText xml:space="preserve">PAGEREF _Toc42 \h</w:instrText>
               <w:fldChar w:fldCharType="separate"/>
-              <w:t xml:space="preserve">23</w:t>
+              <w:t xml:space="preserve">22</w:t>
               <w:fldChar w:fldCharType="end"/>
             </w:r>
           </w:hyperlink>
@@ -3909,13 +3815,7 @@
               <w:rPr>
                 <w:rStyle w:val="970"/>
               </w:rPr>
-              <w:t xml:space="preserve">Matr</w:t>
-            </w:r>
-            <w:r>
-              <w:rPr>
-                <w:rStyle w:val="970"/>
-              </w:rPr>
-              <w:t xml:space="preserve">ículas</w:t>
+              <w:t xml:space="preserve">Candidaturas DGES</w:t>
             </w:r>
             <w:r>
               <w:rPr>
@@ -3928,6 +3828,49 @@
             <w:r>
               <w:fldChar w:fldCharType="begin"/>
               <w:instrText xml:space="preserve">PAGEREF _Toc43 \h</w:instrText>
+              <w:fldChar w:fldCharType="separate"/>
+              <w:t xml:space="preserve">22</w:t>
+              <w:fldChar w:fldCharType="end"/>
+            </w:r>
+          </w:hyperlink>
+          <w:r/>
+          <w:r/>
+        </w:p>
+        <w:p>
+          <w:pPr>
+            <w:pStyle w:val="997"/>
+            <w:pBdr/>
+            <w:tabs>
+              <w:tab w:val="right" w:leader="dot" w:pos="8494"/>
+            </w:tabs>
+            <w:spacing/>
+            <w:ind/>
+            <w:rPr/>
+          </w:pPr>
+          <w:r/>
+          <w:hyperlink w:tooltip="#_Toc44" w:anchor="_Toc44" w:history="1">
+            <w:r>
+              <w:rPr>
+                <w:rStyle w:val="970"/>
+              </w:rPr>
+            </w:r>
+            <w:r>
+              <w:rPr>
+                <w:rStyle w:val="970"/>
+              </w:rPr>
+              <w:t xml:space="preserve">Candidaturas Locais</w:t>
+            </w:r>
+            <w:r>
+              <w:rPr>
+                <w:rStyle w:val="970"/>
+              </w:rPr>
+            </w:r>
+            <w:r>
+              <w:tab/>
+            </w:r>
+            <w:r>
+              <w:fldChar w:fldCharType="begin"/>
+              <w:instrText xml:space="preserve">PAGEREF _Toc44 \h</w:instrText>
               <w:fldChar w:fldCharType="separate"/>
               <w:t xml:space="preserve">23</w:t>
               <w:fldChar w:fldCharType="end"/>
@@ -3948,7 +3891,56 @@
             <w:rPr/>
           </w:pPr>
           <w:r/>
-          <w:hyperlink w:tooltip="#_Toc44" w:anchor="_Toc44" w:history="1">
+          <w:hyperlink w:tooltip="#_Toc45" w:anchor="_Toc45" w:history="1">
+            <w:r>
+              <w:rPr>
+                <w:rStyle w:val="970"/>
+              </w:rPr>
+            </w:r>
+            <w:r>
+              <w:rPr>
+                <w:rStyle w:val="970"/>
+              </w:rPr>
+              <w:t xml:space="preserve">Matr</w:t>
+            </w:r>
+            <w:r>
+              <w:rPr>
+                <w:rStyle w:val="970"/>
+              </w:rPr>
+              <w:t xml:space="preserve">ículas</w:t>
+            </w:r>
+            <w:r>
+              <w:rPr>
+                <w:rStyle w:val="970"/>
+              </w:rPr>
+            </w:r>
+            <w:r>
+              <w:tab/>
+            </w:r>
+            <w:r>
+              <w:fldChar w:fldCharType="begin"/>
+              <w:instrText xml:space="preserve">PAGEREF _Toc45 \h</w:instrText>
+              <w:fldChar w:fldCharType="separate"/>
+              <w:t xml:space="preserve">23</w:t>
+              <w:fldChar w:fldCharType="end"/>
+            </w:r>
+          </w:hyperlink>
+          <w:r/>
+          <w:r/>
+        </w:p>
+        <w:p>
+          <w:pPr>
+            <w:pStyle w:val="997"/>
+            <w:pBdr/>
+            <w:tabs>
+              <w:tab w:val="right" w:leader="dot" w:pos="8494"/>
+            </w:tabs>
+            <w:spacing/>
+            <w:ind/>
+            <w:rPr/>
+          </w:pPr>
+          <w:r/>
+          <w:hyperlink w:tooltip="#_Toc46" w:anchor="_Toc46" w:history="1">
             <w:r>
               <w:rPr>
                 <w:rStyle w:val="970"/>
@@ -3982,101 +3974,9 @@
             </w:r>
             <w:r>
               <w:fldChar w:fldCharType="begin"/>
-              <w:instrText xml:space="preserve">PAGEREF _Toc44 \h</w:instrText>
+              <w:instrText xml:space="preserve">PAGEREF _Toc46 \h</w:instrText>
               <w:fldChar w:fldCharType="separate"/>
               <w:t xml:space="preserve">24</w:t>
-              <w:fldChar w:fldCharType="end"/>
-            </w:r>
-          </w:hyperlink>
-          <w:r/>
-          <w:r/>
-        </w:p>
-        <w:p>
-          <w:pPr>
-            <w:pStyle w:val="997"/>
-            <w:pBdr/>
-            <w:tabs>
-              <w:tab w:val="right" w:leader="dot" w:pos="8494"/>
-            </w:tabs>
-            <w:spacing/>
-            <w:ind/>
-            <w:rPr/>
-          </w:pPr>
-          <w:r/>
-          <w:hyperlink w:tooltip="#_Toc45" w:anchor="_Toc45" w:history="1">
-            <w:r>
-              <w:rPr>
-                <w:rStyle w:val="970"/>
-              </w:rPr>
-            </w:r>
-            <w:r>
-              <w:rPr>
-                <w:rStyle w:val="970"/>
-              </w:rPr>
-              <w:t xml:space="preserve">Hor</w:t>
-            </w:r>
-            <w:r>
-              <w:rPr>
-                <w:rStyle w:val="970"/>
-              </w:rPr>
-              <w:t xml:space="preserve">ários</w:t>
-            </w:r>
-            <w:r>
-              <w:rPr>
-                <w:rStyle w:val="970"/>
-              </w:rPr>
-            </w:r>
-            <w:r>
-              <w:tab/>
-            </w:r>
-            <w:r>
-              <w:fldChar w:fldCharType="begin"/>
-              <w:instrText xml:space="preserve">PAGEREF _Toc45 \h</w:instrText>
-              <w:fldChar w:fldCharType="separate"/>
-              <w:t xml:space="preserve">24</w:t>
-              <w:fldChar w:fldCharType="end"/>
-            </w:r>
-          </w:hyperlink>
-          <w:r/>
-          <w:r/>
-        </w:p>
-        <w:p>
-          <w:pPr>
-            <w:pStyle w:val="997"/>
-            <w:pBdr/>
-            <w:tabs>
-              <w:tab w:val="right" w:leader="dot" w:pos="8494"/>
-            </w:tabs>
-            <w:spacing/>
-            <w:ind/>
-            <w:rPr/>
-          </w:pPr>
-          <w:r/>
-          <w:hyperlink w:tooltip="#_Toc46" w:anchor="_Toc46" w:history="1">
-            <w:r>
-              <w:rPr>
-                <w:rStyle w:val="970"/>
-              </w:rPr>
-            </w:r>
-            <w:r>
-              <w:rPr>
-                <w:rStyle w:val="970"/>
-              </w:rPr>
-              <w:t xml:space="preserve">IAM</w:t>
-            </w:r>
-            <w:r>
-              <w:rPr>
-                <w:rStyle w:val="970"/>
-              </w:rPr>
-            </w:r>
-            <w:r>
-              <w:tab/>
-            </w:r>
-            <w:r>
-              <w:fldChar w:fldCharType="begin"/>
-              <w:instrText xml:space="preserve">PAGEREF _Toc46 \h</w:instrText>
-              <w:fldChar w:fldCharType="separate"/>
-              <w:t xml:space="preserve">25</w:t>
               <w:fldChar w:fldCharType="end"/>
             </w:r>
           </w:hyperlink>
@@ -4105,6 +4005,98 @@
               <w:rPr>
                 <w:rStyle w:val="970"/>
               </w:rPr>
+              <w:t xml:space="preserve">Hor</w:t>
+            </w:r>
+            <w:r>
+              <w:rPr>
+                <w:rStyle w:val="970"/>
+              </w:rPr>
+              <w:t xml:space="preserve">ários</w:t>
+            </w:r>
+            <w:r>
+              <w:rPr>
+                <w:rStyle w:val="970"/>
+              </w:rPr>
+            </w:r>
+            <w:r>
+              <w:tab/>
+            </w:r>
+            <w:r>
+              <w:fldChar w:fldCharType="begin"/>
+              <w:instrText xml:space="preserve">PAGEREF _Toc47 \h</w:instrText>
+              <w:fldChar w:fldCharType="separate"/>
+              <w:t xml:space="preserve">24</w:t>
+              <w:fldChar w:fldCharType="end"/>
+            </w:r>
+          </w:hyperlink>
+          <w:r/>
+          <w:r/>
+        </w:p>
+        <w:p>
+          <w:pPr>
+            <w:pStyle w:val="997"/>
+            <w:pBdr/>
+            <w:tabs>
+              <w:tab w:val="right" w:leader="dot" w:pos="8494"/>
+            </w:tabs>
+            <w:spacing/>
+            <w:ind/>
+            <w:rPr/>
+          </w:pPr>
+          <w:r/>
+          <w:hyperlink w:tooltip="#_Toc48" w:anchor="_Toc48" w:history="1">
+            <w:r>
+              <w:rPr>
+                <w:rStyle w:val="970"/>
+              </w:rPr>
+            </w:r>
+            <w:r>
+              <w:rPr>
+                <w:rStyle w:val="970"/>
+              </w:rPr>
+              <w:t xml:space="preserve">IAM</w:t>
+            </w:r>
+            <w:r>
+              <w:rPr>
+                <w:rStyle w:val="970"/>
+              </w:rPr>
+            </w:r>
+            <w:r>
+              <w:tab/>
+            </w:r>
+            <w:r>
+              <w:fldChar w:fldCharType="begin"/>
+              <w:instrText xml:space="preserve">PAGEREF _Toc48 \h</w:instrText>
+              <w:fldChar w:fldCharType="separate"/>
+              <w:t xml:space="preserve">25</w:t>
+              <w:fldChar w:fldCharType="end"/>
+            </w:r>
+          </w:hyperlink>
+          <w:r/>
+          <w:r/>
+        </w:p>
+        <w:p>
+          <w:pPr>
+            <w:pStyle w:val="997"/>
+            <w:pBdr/>
+            <w:tabs>
+              <w:tab w:val="right" w:leader="dot" w:pos="8494"/>
+            </w:tabs>
+            <w:spacing/>
+            <w:ind/>
+            <w:rPr/>
+          </w:pPr>
+          <w:r/>
+          <w:hyperlink w:tooltip="#_Toc49" w:anchor="_Toc49" w:history="1">
+            <w:r>
+              <w:rPr>
+                <w:rStyle w:val="970"/>
+              </w:rPr>
+            </w:r>
+            <w:r>
+              <w:rPr>
+                <w:rStyle w:val="970"/>
+              </w:rPr>
               <w:t xml:space="preserve">Notificaç</w:t>
             </w:r>
             <w:r>
@@ -4123,7 +4115,7 @@
             </w:r>
             <w:r>
               <w:fldChar w:fldCharType="begin"/>
-              <w:instrText xml:space="preserve">PAGEREF _Toc47 \h</w:instrText>
+              <w:instrText xml:space="preserve">PAGEREF _Toc49 \h</w:instrText>
               <w:fldChar w:fldCharType="separate"/>
               <w:t xml:space="preserve">25</w:t>
               <w:fldChar w:fldCharType="end"/>
@@ -4159,6 +4151,11 @@
               <w:lang w:val="pt-PT"/>
             </w:rPr>
           </w:r>
+          <w:r>
+            <w:rPr>
+              <w:lang w:val="pt-PT"/>
+            </w:rPr>
+          </w:r>
         </w:p>
       </w:sdtContent>
     </w:sdt>
@@ -4249,14 +4246,19 @@
         </w:rPr>
       </w:pPr>
       <w:r/>
-      <w:bookmarkStart w:id="1" w:name="_Toc1"/>
+      <w:bookmarkStart w:id="3" w:name="_Toc3"/>
       <w:r>
         <w:rPr>
           <w:lang w:val="pt-PT"/>
         </w:rPr>
         <w:t xml:space="preserve">Índice de Figuras</w:t>
       </w:r>
-      <w:bookmarkEnd w:id="1"/>
+      <w:r>
+        <w:rPr>
+          <w:lang w:val="pt-PT"/>
+        </w:rPr>
+      </w:r>
+      <w:bookmarkEnd w:id="3"/>
       <w:r>
         <w:rPr>
           <w:lang w:val="pt-PT"/>
@@ -5939,6 +5941,13 @@
           <w:lang w:val="pt-PT"/>
         </w:rPr>
       </w:r>
+      <w:r>
+        <w:rPr>
+          <w:rFonts w:asciiTheme="majorHAnsi" w:hAnsiTheme="majorHAnsi" w:eastAsiaTheme="majorEastAsia" w:cstheme="majorBidi"/>
+          <w:highlight w:val="none"/>
+          <w:lang w:val="pt-PT"/>
+        </w:rPr>
+      </w:r>
     </w:p>
     <w:p>
       <w:pPr>
@@ -5991,15 +6000,22 @@
         </w:rPr>
       </w:pPr>
       <w:r/>
-      <w:bookmarkStart w:id="2" w:name="_Toc2"/>
+      <w:bookmarkStart w:id="4" w:name="_Toc4"/>
+      <w:r/>
       <w:r>
         <w:rPr>
           <w:highlight w:val="none"/>
           <w:lang w:val="pt-BR"/>
         </w:rPr>
-        <w:t xml:space="preserve">Escopo</w:t>
-      </w:r>
-      <w:bookmarkEnd w:id="2"/>
+        <w:t xml:space="preserve">Âmbito</w:t>
+      </w:r>
+      <w:r>
+        <w:rPr>
+          <w:highlight w:val="none"/>
+          <w:lang w:val="pt-BR"/>
+        </w:rPr>
+      </w:r>
+      <w:bookmarkEnd w:id="4"/>
       <w:r>
         <w:rPr>
           <w:lang w:val="pt-PT"/>
@@ -6073,10 +6089,10 @@
         </w:rPr>
       </w:pPr>
       <w:r>
-        <w:t xml:space="preserve">O sistema será concebido para operar num modelo multi-instituição, onde uma administração central define as regras e estruturas globais, mas cada instituição (escola ou faculdade) mantém autonomia na gestão da sua própria oferta formativa, corpo docente e </w:t>
-      </w:r>
-      <w:r>
-        <w:t xml:space="preserve">discente.</w:t>
+        <w:t xml:space="preserve">O sistema será concebido para operar num modelo multi-instituição, onde uma administração central define as regras e estruturas globais, mas cada instituição (escola ou faculdade) mantém autonomia na gestão da sua própria oferta formativa e corpo docente</w:t>
+      </w:r>
+      <w:r>
+        <w:t xml:space="preserve">.</w:t>
       </w:r>
       <w:r>
         <w:rPr>
@@ -6126,15 +6142,27 @@
         </w:rPr>
       </w:pPr>
       <w:r/>
-      <w:bookmarkStart w:id="3" w:name="_Toc3"/>
+      <w:bookmarkStart w:id="5" w:name="_Toc5"/>
       <w:r>
         <w:rPr>
           <w:highlight w:val="none"/>
           <w:lang w:val="pt-BR"/>
         </w:rPr>
-        <w:t xml:space="preserve">Escopo funcional</w:t>
-      </w:r>
-      <w:bookmarkEnd w:id="3"/>
+        <w:t xml:space="preserve">Âmbito</w:t>
+      </w:r>
+      <w:r>
+        <w:rPr>
+          <w:highlight w:val="none"/>
+          <w:lang w:val="pt-BR"/>
+        </w:rPr>
+        <w:t xml:space="preserve"> Funcional</w:t>
+      </w:r>
+      <w:r>
+        <w:rPr>
+          <w:lang w:val="pt-PT"/>
+        </w:rPr>
+      </w:r>
+      <w:bookmarkEnd w:id="5"/>
       <w:r>
         <w:rPr>
           <w:lang w:val="pt-PT"/>
@@ -6161,7 +6189,7 @@
         </w:rPr>
       </w:pPr>
       <w:r/>
-      <w:bookmarkStart w:id="4" w:name="_Toc4"/>
+      <w:bookmarkStart w:id="6" w:name="_Toc6"/>
       <w:r>
         <w:rPr>
           <w:highlight w:val="none"/>
@@ -6183,7 +6211,12 @@
         </w:rPr>
         <w:t xml:space="preserve">émica</w:t>
       </w:r>
-      <w:bookmarkEnd w:id="4"/>
+      <w:r>
+        <w:rPr>
+          <w:lang w:val="pt-PT"/>
+        </w:rPr>
+      </w:r>
+      <w:bookmarkEnd w:id="6"/>
       <w:r>
         <w:rPr>
           <w:lang w:val="pt-PT"/>
@@ -6358,7 +6391,7 @@
         </w:rPr>
       </w:pPr>
       <w:r/>
-      <w:bookmarkStart w:id="5" w:name="_Toc5"/>
+      <w:bookmarkStart w:id="7" w:name="_Toc7"/>
       <w:r>
         <w:rPr>
           <w:highlight w:val="none"/>
@@ -6373,7 +6406,12 @@
         </w:rPr>
         <w:t xml:space="preserve">ão do Ciclo de Vida do Aluno</w:t>
       </w:r>
-      <w:bookmarkEnd w:id="5"/>
+      <w:r>
+        <w:rPr>
+          <w:lang w:val="pt-PT"/>
+        </w:rPr>
+      </w:r>
+      <w:bookmarkEnd w:id="7"/>
       <w:r>
         <w:rPr>
           <w:lang w:val="pt-PT"/>
@@ -6624,7 +6662,7 @@
         </w:rPr>
       </w:pPr>
       <w:r/>
-      <w:bookmarkStart w:id="6" w:name="_Toc6"/>
+      <w:bookmarkStart w:id="8" w:name="_Toc8"/>
       <w:r>
         <w:rPr>
           <w:highlight w:val="none"/>
@@ -6639,7 +6677,12 @@
         </w:rPr>
         <w:t xml:space="preserve">ão de Colaboradores</w:t>
       </w:r>
-      <w:bookmarkEnd w:id="6"/>
+      <w:r>
+        <w:rPr>
+          <w:lang w:val="pt-PT"/>
+        </w:rPr>
+      </w:r>
+      <w:bookmarkEnd w:id="8"/>
       <w:r>
         <w:rPr>
           <w:lang w:val="pt-PT"/>
@@ -6792,7 +6835,7 @@
         </w:rPr>
       </w:pPr>
       <w:r/>
-      <w:bookmarkStart w:id="7" w:name="_Toc7"/>
+      <w:bookmarkStart w:id="9" w:name="_Toc9"/>
       <w:r>
         <w:rPr>
           <w:highlight w:val="none"/>
@@ -6820,7 +6863,12 @@
         </w:rPr>
         <w:t xml:space="preserve"> e Notas</w:t>
       </w:r>
-      <w:bookmarkEnd w:id="7"/>
+      <w:r>
+        <w:rPr>
+          <w:lang w:val="pt-PT"/>
+        </w:rPr>
+      </w:r>
+      <w:bookmarkEnd w:id="9"/>
       <w:r>
         <w:rPr>
           <w:lang w:val="pt-PT"/>
@@ -7048,14 +7096,19 @@
         </w:rPr>
       </w:pPr>
       <w:r/>
-      <w:bookmarkStart w:id="8" w:name="_Toc8"/>
+      <w:bookmarkStart w:id="10" w:name="_Toc10"/>
       <w:r>
         <w:t xml:space="preserve">Autenticaç</w:t>
       </w:r>
       <w:r>
         <w:t xml:space="preserve">ão e Autorização</w:t>
       </w:r>
-      <w:bookmarkEnd w:id="8"/>
+      <w:r>
+        <w:rPr>
+          <w:lang w:val="pt-PT"/>
+        </w:rPr>
+      </w:r>
+      <w:bookmarkEnd w:id="10"/>
       <w:r>
         <w:rPr>
           <w:lang w:val="pt-PT"/>
@@ -7124,6 +7177,7 @@
     </w:p>
     <w:p>
       <w:pPr>
+        <w:pStyle w:val="952"/>
         <w:pBdr/>
         <w:spacing/>
         <w:ind/>
@@ -7131,47 +7185,26 @@
           <w:lang w:val="pt-PT"/>
         </w:rPr>
       </w:pPr>
-      <w:r>
-        <w:rPr>
-          <w:lang w:val="pt-PT" w:bidi="pt-PT"/>
-        </w:rPr>
+      <w:r/>
+      <w:bookmarkStart w:id="11" w:name="_Toc11"/>
+      <w:r>
+        <w:rPr>
+          <w:lang w:val="pt-BR"/>
+        </w:rPr>
+        <w:t xml:space="preserve">Fora de </w:t>
+      </w:r>
+      <w:r>
+        <w:rPr>
+          <w:lang w:val="pt-BR"/>
+        </w:rPr>
+        <w:t xml:space="preserve">Âmbito</w:t>
       </w:r>
       <w:r>
         <w:rPr>
           <w:lang w:val="pt-PT"/>
         </w:rPr>
       </w:r>
-      <w:r>
-        <w:rPr>
-          <w:lang w:val="pt-PT"/>
-        </w:rPr>
-      </w:r>
-    </w:p>
-    <w:p>
-      <w:pPr>
-        <w:pStyle w:val="952"/>
-        <w:pBdr/>
-        <w:spacing/>
-        <w:ind/>
-        <w:rPr>
-          <w:lang w:val="pt-PT"/>
-        </w:rPr>
-      </w:pPr>
-      <w:r/>
-      <w:bookmarkStart w:id="9" w:name="_Toc9"/>
-      <w:r>
-        <w:rPr>
-          <w:lang w:val="pt-BR"/>
-        </w:rPr>
-        <w:t xml:space="preserve">Fora de </w:t>
-      </w:r>
-      <w:r>
-        <w:rPr>
-          <w:lang w:val="pt-BR"/>
-        </w:rPr>
-        <w:t xml:space="preserve">Âmbito</w:t>
-      </w:r>
-      <w:bookmarkEnd w:id="9"/>
+      <w:bookmarkEnd w:id="11"/>
       <w:r>
         <w:rPr>
           <w:lang w:val="pt-PT"/>
@@ -7403,14 +7436,20 @@
         </w:rPr>
       </w:pPr>
       <w:r/>
-      <w:bookmarkStart w:id="10" w:name="_Toc10"/>
+      <w:bookmarkStart w:id="12" w:name="_Toc12"/>
       <w:r>
         <w:rPr>
           <w:lang w:val="pt-PT"/>
         </w:rPr>
         <w:t xml:space="preserve">Arquitetura de Microserviços</w:t>
       </w:r>
-      <w:bookmarkEnd w:id="10"/>
+      <w:r>
+        <w:rPr>
+          <w:highlight w:val="none"/>
+          <w:lang w:val="pt-PT"/>
+        </w:rPr>
+      </w:r>
+      <w:bookmarkEnd w:id="12"/>
       <w:r>
         <w:rPr>
           <w:highlight w:val="none"/>
@@ -7567,7 +7606,7 @@
         </w:rPr>
       </w:pPr>
       <w:r/>
-      <w:bookmarkStart w:id="11" w:name="_Toc11"/>
+      <w:bookmarkStart w:id="13" w:name="_Toc13"/>
       <w:r>
         <w:rPr>
           <w:highlight w:val="none"/>
@@ -7582,7 +7621,12 @@
         </w:rPr>
         <w:t xml:space="preserve">ão de Utilizadores</w:t>
       </w:r>
-      <w:bookmarkEnd w:id="11"/>
+      <w:r>
+        <w:rPr>
+          <w:lang w:val="pt-PT"/>
+        </w:rPr>
+      </w:r>
+      <w:bookmarkEnd w:id="13"/>
       <w:r>
         <w:rPr>
           <w:lang w:val="pt-PT"/>
@@ -7605,14 +7649,19 @@
         </w:rPr>
       </w:pPr>
       <w:r/>
-      <w:bookmarkStart w:id="12" w:name="_Toc12"/>
+      <w:bookmarkStart w:id="14" w:name="_Toc14"/>
       <w:r>
         <w:rPr>
           <w:lang w:val="pt-PT"/>
         </w:rPr>
         <w:t xml:space="preserve">IAM</w:t>
       </w:r>
-      <w:bookmarkEnd w:id="12"/>
+      <w:r>
+        <w:rPr>
+          <w:lang w:val="pt-PT"/>
+        </w:rPr>
+      </w:r>
+      <w:bookmarkEnd w:id="14"/>
       <w:r>
         <w:rPr>
           <w:lang w:val="pt-PT"/>
@@ -7867,7 +7916,7 @@
         </w:rPr>
       </w:pPr>
       <w:r/>
-      <w:bookmarkStart w:id="13" w:name="_Toc13"/>
+      <w:bookmarkStart w:id="15" w:name="_Toc15"/>
       <w:r>
         <w:rPr>
           <w:highlight w:val="none"/>
@@ -7875,7 +7924,12 @@
         </w:rPr>
         <w:t xml:space="preserve">Processo de Candidatura</w:t>
       </w:r>
-      <w:bookmarkEnd w:id="13"/>
+      <w:r>
+        <w:rPr>
+          <w:lang w:val="pt-PT"/>
+        </w:rPr>
+      </w:r>
+      <w:bookmarkEnd w:id="15"/>
       <w:r>
         <w:rPr>
           <w:lang w:val="pt-PT"/>
@@ -7898,7 +7952,7 @@
         </w:rPr>
       </w:pPr>
       <w:r/>
-      <w:bookmarkStart w:id="14" w:name="_Toc14"/>
+      <w:bookmarkStart w:id="16" w:name="_Toc16"/>
       <w:r>
         <w:rPr>
           <w:highlight w:val="none"/>
@@ -7912,7 +7966,12 @@
         </w:rPr>
         <w:t xml:space="preserve"> Locais</w:t>
       </w:r>
-      <w:bookmarkEnd w:id="14"/>
+      <w:r>
+        <w:rPr>
+          <w:lang w:val="pt-PT"/>
+        </w:rPr>
+      </w:r>
+      <w:bookmarkEnd w:id="16"/>
       <w:r>
         <w:rPr>
           <w:lang w:val="pt-PT"/>
@@ -8194,7 +8253,7 @@
         </w:rPr>
       </w:pPr>
       <w:r/>
-      <w:bookmarkStart w:id="15" w:name="_Toc15"/>
+      <w:bookmarkStart w:id="17" w:name="_Toc17"/>
       <w:r>
         <w:rPr>
           <w:highlight w:val="none"/>
@@ -8202,7 +8261,12 @@
         </w:rPr>
         <w:t xml:space="preserve">Candidaturas DGES</w:t>
       </w:r>
-      <w:bookmarkEnd w:id="15"/>
+      <w:r>
+        <w:rPr>
+          <w:lang w:val="pt-PT"/>
+        </w:rPr>
+      </w:r>
+      <w:bookmarkEnd w:id="17"/>
       <w:r>
         <w:rPr>
           <w:lang w:val="pt-PT"/>
@@ -8461,7 +8525,7 @@
         </w:rPr>
       </w:pPr>
       <w:r/>
-      <w:bookmarkStart w:id="16" w:name="_Toc16"/>
+      <w:bookmarkStart w:id="18" w:name="_Toc18"/>
       <w:r>
         <w:rPr>
           <w:lang w:val="pt-PT"/>
@@ -8474,7 +8538,12 @@
         </w:rPr>
         <w:t xml:space="preserve">ículas</w:t>
       </w:r>
-      <w:bookmarkEnd w:id="16"/>
+      <w:r>
+        <w:rPr>
+          <w:lang w:val="pt-PT"/>
+        </w:rPr>
+      </w:r>
+      <w:bookmarkEnd w:id="18"/>
       <w:r>
         <w:rPr>
           <w:lang w:val="pt-PT"/>
@@ -8583,6 +8652,7 @@
       </w:r>
       <w:r>
         <w:rPr>
+          <w:highlight w:val="none"/>
           <w:lang w:val="pt-PT"/>
         </w:rPr>
       </w:r>
@@ -8678,7 +8748,6 @@
       </w:r>
       <w:r>
         <w:rPr>
-          <w:highlight w:val="none"/>
           <w:lang w:val="pt-PT"/>
         </w:rPr>
       </w:r>
@@ -8756,7 +8825,7 @@
         </w:rPr>
       </w:pPr>
       <w:r/>
-      <w:bookmarkStart w:id="17" w:name="_Toc17"/>
+      <w:bookmarkStart w:id="19" w:name="_Toc19"/>
       <w:r>
         <w:rPr>
           <w:lang w:val="pt-PT"/>
@@ -8775,7 +8844,12 @@
         </w:rPr>
         <w:t xml:space="preserve">émica</w:t>
       </w:r>
-      <w:bookmarkEnd w:id="17"/>
+      <w:r>
+        <w:rPr>
+          <w:lang w:val="pt-PT"/>
+        </w:rPr>
+      </w:r>
+      <w:bookmarkEnd w:id="19"/>
       <w:r>
         <w:rPr>
           <w:lang w:val="pt-PT"/>
@@ -8798,7 +8872,7 @@
         </w:rPr>
       </w:pPr>
       <w:r/>
-      <w:bookmarkStart w:id="18" w:name="_Toc18"/>
+      <w:bookmarkStart w:id="20" w:name="_Toc20"/>
       <w:r>
         <w:rPr>
           <w:lang w:val="pt-PT"/>
@@ -8811,7 +8885,12 @@
         </w:rPr>
         <w:t xml:space="preserve">ões</w:t>
       </w:r>
-      <w:bookmarkEnd w:id="18"/>
+      <w:r>
+        <w:rPr>
+          <w:lang w:val="pt-PT"/>
+        </w:rPr>
+      </w:r>
+      <w:bookmarkEnd w:id="20"/>
       <w:r>
         <w:rPr>
           <w:lang w:val="pt-PT"/>
@@ -9082,14 +9161,19 @@
         </w:rPr>
       </w:pPr>
       <w:r/>
-      <w:bookmarkStart w:id="19" w:name="_Toc19"/>
+      <w:bookmarkStart w:id="21" w:name="_Toc21"/>
       <w:r>
         <w:rPr>
           <w:lang w:val="pt-PT"/>
         </w:rPr>
         <w:t xml:space="preserve">Pautas</w:t>
       </w:r>
-      <w:bookmarkEnd w:id="19"/>
+      <w:r>
+        <w:rPr>
+          <w:lang w:val="pt-PT"/>
+        </w:rPr>
+      </w:r>
+      <w:bookmarkEnd w:id="21"/>
       <w:r>
         <w:rPr>
           <w:lang w:val="pt-PT"/>
@@ -9216,6 +9300,7 @@
       </w:r>
       <w:r>
         <w:rPr>
+          <w:highlight w:val="none"/>
           <w:lang w:val="pt-PT"/>
         </w:rPr>
       </w:r>
@@ -9365,7 +9450,6 @@
       </w:r>
       <w:r>
         <w:rPr>
-          <w:highlight w:val="none"/>
           <w:lang w:val="pt-PT"/>
         </w:rPr>
       </w:r>
@@ -9386,7 +9470,7 @@
         </w:rPr>
       </w:pPr>
       <w:r/>
-      <w:bookmarkStart w:id="20" w:name="_Toc20"/>
+      <w:bookmarkStart w:id="22" w:name="_Toc22"/>
       <w:r>
         <w:rPr>
           <w:lang w:val="pt-PT"/>
@@ -9399,7 +9483,12 @@
         </w:rPr>
         <w:t xml:space="preserve">ários</w:t>
       </w:r>
-      <w:bookmarkEnd w:id="20"/>
+      <w:r>
+        <w:rPr>
+          <w:lang w:val="pt-PT"/>
+        </w:rPr>
+      </w:r>
+      <w:bookmarkEnd w:id="22"/>
       <w:r>
         <w:rPr>
           <w:lang w:val="pt-PT"/>
@@ -9647,7 +9736,7 @@
         </w:rPr>
       </w:pPr>
       <w:r/>
-      <w:bookmarkStart w:id="21" w:name="_Toc21"/>
+      <w:bookmarkStart w:id="23" w:name="_Toc23"/>
       <w:r>
         <w:rPr>
           <w:lang w:val="pt-PT"/>
@@ -9666,7 +9755,12 @@
         </w:rPr>
         <w:t xml:space="preserve">émica</w:t>
       </w:r>
-      <w:bookmarkEnd w:id="21"/>
+      <w:r>
+        <w:rPr>
+          <w:lang w:val="pt-PT"/>
+        </w:rPr>
+      </w:r>
+      <w:bookmarkEnd w:id="23"/>
       <w:r>
         <w:rPr>
           <w:lang w:val="pt-PT"/>
@@ -9912,7 +10006,7 @@
         </w:rPr>
       </w:pPr>
       <w:r/>
-      <w:bookmarkStart w:id="22" w:name="_Toc22"/>
+      <w:bookmarkStart w:id="24" w:name="_Toc24"/>
       <w:r>
         <w:rPr>
           <w:lang w:val="pt-PT"/>
@@ -9937,7 +10031,12 @@
         </w:rPr>
         <w:t xml:space="preserve">ão</w:t>
       </w:r>
-      <w:bookmarkEnd w:id="22"/>
+      <w:r>
+        <w:rPr>
+          <w:lang w:val="pt-PT"/>
+        </w:rPr>
+      </w:r>
+      <w:bookmarkEnd w:id="24"/>
       <w:r>
         <w:rPr>
           <w:lang w:val="pt-PT"/>
@@ -9960,7 +10059,7 @@
         </w:rPr>
       </w:pPr>
       <w:r/>
-      <w:bookmarkStart w:id="23" w:name="_Toc23"/>
+      <w:bookmarkStart w:id="25" w:name="_Toc25"/>
       <w:r>
         <w:rPr>
           <w:lang w:val="pt-BR"/>
@@ -9979,7 +10078,12 @@
         </w:rPr>
         <w:t xml:space="preserve">ões</w:t>
       </w:r>
-      <w:bookmarkEnd w:id="23"/>
+      <w:r>
+        <w:rPr>
+          <w:lang w:val="pt-PT"/>
+        </w:rPr>
+      </w:r>
+      <w:bookmarkEnd w:id="25"/>
       <w:r>
         <w:rPr>
           <w:lang w:val="pt-PT"/>
@@ -10293,7 +10397,7 @@
         </w:rPr>
       </w:pPr>
       <w:r/>
-      <w:bookmarkStart w:id="24" w:name="_Toc24"/>
+      <w:bookmarkStart w:id="26" w:name="_Toc26"/>
       <w:r>
         <w:rPr>
           <w:lang w:val="pt-PT"/>
@@ -10306,7 +10410,12 @@
         </w:rPr>
         <w:t xml:space="preserve">ões</w:t>
       </w:r>
-      <w:bookmarkEnd w:id="24"/>
+      <w:r>
+        <w:rPr>
+          <w:lang w:val="pt-PT"/>
+        </w:rPr>
+      </w:r>
+      <w:bookmarkEnd w:id="26"/>
       <w:r>
         <w:rPr>
           <w:lang w:val="pt-PT"/>
@@ -10619,7 +10728,7 @@
         </w:rPr>
       </w:pPr>
       <w:r/>
-      <w:bookmarkStart w:id="25" w:name="_Toc25"/>
+      <w:bookmarkStart w:id="27" w:name="_Toc27"/>
       <w:r>
         <w:rPr>
           <w:lang w:val="pt-PT"/>
@@ -10632,7 +10741,12 @@
         </w:rPr>
         <w:t xml:space="preserve">ões</w:t>
       </w:r>
-      <w:bookmarkEnd w:id="25"/>
+      <w:r>
+        <w:rPr>
+          <w:lang w:val="pt-PT"/>
+        </w:rPr>
+      </w:r>
+      <w:bookmarkEnd w:id="27"/>
       <w:r>
         <w:rPr>
           <w:lang w:val="pt-PT"/>
@@ -10904,7 +11018,7 @@
         </w:rPr>
       </w:pPr>
       <w:r/>
-      <w:bookmarkStart w:id="26" w:name="_Toc26"/>
+      <w:bookmarkStart w:id="28" w:name="_Toc28"/>
       <w:r>
         <w:rPr>
           <w:highlight w:val="none"/>
@@ -10919,19 +11033,25 @@
         </w:rPr>
         <w:t xml:space="preserve">ócio</w:t>
       </w:r>
-      <w:bookmarkEnd w:id="26"/>
       <w:r>
         <w:rPr>
           <w:highlight w:val="none"/>
           <w:lang w:val="pt-PT"/>
         </w:rPr>
       </w:r>
+      <w:bookmarkEnd w:id="28"/>
       <w:r>
         <w:rPr>
           <w:highlight w:val="none"/>
           <w:lang w:val="pt-PT"/>
         </w:rPr>
       </w:r>
+      <w:r>
+        <w:rPr>
+          <w:highlight w:val="none"/>
+          <w:lang w:val="pt-PT"/>
+        </w:rPr>
+      </w:r>
     </w:p>
     <w:p>
       <w:pPr>
@@ -10944,7 +11064,7 @@
         </w:rPr>
       </w:pPr>
       <w:r/>
-      <w:bookmarkStart w:id="27" w:name="_Toc27"/>
+      <w:bookmarkStart w:id="29" w:name="_Toc29"/>
       <w:r>
         <w:rPr>
           <w:lang w:val="pt-BR"/>
@@ -10957,7 +11077,12 @@
         </w:rPr>
         <w:t xml:space="preserve">ão</w:t>
       </w:r>
-      <w:bookmarkEnd w:id="27"/>
+      <w:r>
+        <w:rPr>
+          <w:lang w:val="pt-PT"/>
+        </w:rPr>
+      </w:r>
+      <w:bookmarkEnd w:id="29"/>
       <w:r>
         <w:rPr>
           <w:lang w:val="pt-PT"/>
@@ -11116,7 +11241,7 @@
         </w:rPr>
       </w:pPr>
       <w:r/>
-      <w:bookmarkStart w:id="28" w:name="_Toc28"/>
+      <w:bookmarkStart w:id="30" w:name="_Toc30"/>
       <w:r>
         <w:rPr>
           <w:lang w:val="pt-BR"/>
@@ -11129,7 +11254,12 @@
         </w:rPr>
         <w:t xml:space="preserve">ões</w:t>
       </w:r>
-      <w:bookmarkEnd w:id="28"/>
+      <w:r>
+        <w:rPr>
+          <w:lang w:val="pt-PT"/>
+        </w:rPr>
+      </w:r>
+      <w:bookmarkEnd w:id="30"/>
       <w:r>
         <w:rPr>
           <w:lang w:val="pt-PT"/>
@@ -11333,7 +11463,7 @@
         </w:rPr>
       </w:pPr>
       <w:r/>
-      <w:bookmarkStart w:id="29" w:name="_Toc29"/>
+      <w:bookmarkStart w:id="31" w:name="_Toc31"/>
       <w:r>
         <w:rPr>
           <w:lang w:val="pt-BR"/>
@@ -11346,7 +11476,12 @@
         </w:rPr>
         <w:t xml:space="preserve">ão de Pautas</w:t>
       </w:r>
-      <w:bookmarkEnd w:id="29"/>
+      <w:r>
+        <w:rPr>
+          <w:lang w:val="pt-PT"/>
+        </w:rPr>
+      </w:r>
+      <w:bookmarkEnd w:id="31"/>
       <w:r>
         <w:rPr>
           <w:lang w:val="pt-PT"/>
@@ -11521,14 +11656,19 @@
         </w:rPr>
       </w:pPr>
       <w:r/>
-      <w:bookmarkStart w:id="30" w:name="_Toc30"/>
+      <w:bookmarkStart w:id="32" w:name="_Toc32"/>
       <w:r>
         <w:rPr>
           <w:lang w:val="pt-BR"/>
         </w:rPr>
         <w:t xml:space="preserve">Candidatura Submetida</w:t>
       </w:r>
-      <w:bookmarkEnd w:id="30"/>
+      <w:r>
+        <w:rPr>
+          <w:lang w:val="pt-BR"/>
+        </w:rPr>
+      </w:r>
+      <w:bookmarkEnd w:id="32"/>
       <w:r>
         <w:rPr>
           <w:lang w:val="pt-BR"/>
@@ -11687,14 +11827,19 @@
         </w:rPr>
       </w:pPr>
       <w:r/>
-      <w:bookmarkStart w:id="31" w:name="_Toc31"/>
+      <w:bookmarkStart w:id="33" w:name="_Toc33"/>
       <w:r>
         <w:rPr>
           <w:lang w:val="pt-BR"/>
         </w:rPr>
         <w:t xml:space="preserve">Processamento de Candidaturas</w:t>
       </w:r>
-      <w:bookmarkEnd w:id="31"/>
+      <w:r>
+        <w:rPr>
+          <w:lang w:val="pt-BR"/>
+        </w:rPr>
+      </w:r>
+      <w:bookmarkEnd w:id="33"/>
       <w:r>
         <w:rPr>
           <w:lang w:val="pt-BR"/>
@@ -11868,7 +12013,7 @@
         </w:rPr>
       </w:pPr>
       <w:r/>
-      <w:bookmarkStart w:id="32" w:name="_Toc32"/>
+      <w:bookmarkStart w:id="34" w:name="_Toc34"/>
       <w:r>
         <w:rPr>
           <w:lang w:val="pt-BR"/>
@@ -11881,7 +12026,12 @@
         </w:rPr>
         <w:t xml:space="preserve">ícula</w:t>
       </w:r>
-      <w:bookmarkEnd w:id="32"/>
+      <w:r>
+        <w:rPr>
+          <w:lang w:val="pt-PT"/>
+        </w:rPr>
+      </w:r>
+      <w:bookmarkEnd w:id="34"/>
       <w:r>
         <w:rPr>
           <w:lang w:val="pt-PT"/>
@@ -12028,7 +12178,7 @@
         </w:rPr>
       </w:pPr>
       <w:r/>
-      <w:bookmarkStart w:id="33" w:name="_Toc33"/>
+      <w:bookmarkStart w:id="35" w:name="_Toc35"/>
       <w:r>
         <w:rPr>
           <w:highlight w:val="none"/>
@@ -12043,7 +12193,12 @@
         </w:rPr>
         <w:t xml:space="preserve">ão de Turmas</w:t>
       </w:r>
-      <w:bookmarkEnd w:id="33"/>
+      <w:r>
+        <w:rPr>
+          <w:lang w:val="pt-PT"/>
+        </w:rPr>
+      </w:r>
+      <w:bookmarkEnd w:id="35"/>
       <w:r>
         <w:rPr>
           <w:lang w:val="pt-PT"/>
@@ -12267,7 +12422,7 @@
         </w:rPr>
       </w:pPr>
       <w:r/>
-      <w:bookmarkStart w:id="34" w:name="_Toc34"/>
+      <w:bookmarkStart w:id="36" w:name="_Toc36"/>
       <w:r>
         <w:rPr>
           <w:highlight w:val="none"/>
@@ -12275,19 +12430,25 @@
         </w:rPr>
         <w:t xml:space="preserve">Diagramas de Estado</w:t>
       </w:r>
-      <w:bookmarkEnd w:id="34"/>
       <w:r>
         <w:rPr>
           <w:lang w:val="pt-PT"/>
           <w14:ligatures w14:val="none"/>
         </w:rPr>
       </w:r>
+      <w:bookmarkEnd w:id="36"/>
       <w:r>
         <w:rPr>
           <w:lang w:val="pt-PT"/>
           <w14:ligatures w14:val="none"/>
         </w:rPr>
       </w:r>
+      <w:r>
+        <w:rPr>
+          <w:lang w:val="pt-PT"/>
+          <w14:ligatures w14:val="none"/>
+        </w:rPr>
+      </w:r>
     </w:p>
     <w:p>
       <w:pPr>
@@ -12326,7 +12487,7 @@
         </w:rPr>
       </w:pPr>
       <w:r/>
-      <w:bookmarkStart w:id="35" w:name="_Toc35"/>
+      <w:bookmarkStart w:id="37" w:name="_Toc37"/>
       <w:r>
         <w:rPr>
           <w:highlight w:val="none"/>
@@ -12334,7 +12495,12 @@
         </w:rPr>
         <w:t xml:space="preserve">Estados de uma Candidatura</w:t>
       </w:r>
-      <w:bookmarkEnd w:id="35"/>
+      <w:r>
+        <w:rPr>
+          <w:lang w:val="pt-PT"/>
+        </w:rPr>
+      </w:r>
+      <w:bookmarkEnd w:id="37"/>
       <w:r>
         <w:rPr>
           <w:lang w:val="pt-PT"/>
@@ -12513,26 +12679,32 @@
         </w:rPr>
       </w:pPr>
       <w:r/>
-      <w:bookmarkStart w:id="36" w:name="_Toc36"/>
+      <w:bookmarkStart w:id="38" w:name="_Toc38"/>
       <w:r>
         <w:rPr>
           <w:lang w:val="pt-PT"/>
         </w:rPr>
         <w:t xml:space="preserve">Bases de Dados</w:t>
       </w:r>
-      <w:bookmarkEnd w:id="36"/>
       <w:r>
         <w:rPr>
           <w:highlight w:val="none"/>
           <w:lang w:val="pt-PT" w:bidi="pt-PT"/>
         </w:rPr>
       </w:r>
+      <w:bookmarkEnd w:id="38"/>
       <w:r>
         <w:rPr>
           <w:highlight w:val="none"/>
           <w:lang w:val="pt-PT" w:bidi="pt-PT"/>
         </w:rPr>
       </w:r>
+      <w:r>
+        <w:rPr>
+          <w:highlight w:val="none"/>
+          <w:lang w:val="pt-PT" w:bidi="pt-PT"/>
+        </w:rPr>
+      </w:r>
     </w:p>
     <w:p>
       <w:pPr>
@@ -12571,7 +12743,7 @@
         </w:rPr>
       </w:pPr>
       <w:r/>
-      <w:bookmarkStart w:id="37" w:name="_Toc37"/>
+      <w:bookmarkStart w:id="39" w:name="_Toc39"/>
       <w:r>
         <w:rPr>
           <w:lang w:val="pt-BR"/>
@@ -12584,7 +12756,12 @@
         </w:rPr>
         <w:t xml:space="preserve">ões</w:t>
       </w:r>
-      <w:bookmarkEnd w:id="37"/>
+      <w:r>
+        <w:rPr>
+          <w:lang w:val="pt-PT"/>
+        </w:rPr>
+      </w:r>
+      <w:bookmarkEnd w:id="39"/>
       <w:r>
         <w:rPr>
           <w:lang w:val="pt-PT"/>
@@ -12735,7 +12912,7 @@
         <w:rPr/>
       </w:pPr>
       <w:r/>
-      <w:bookmarkStart w:id="38" w:name="_Toc38"/>
+      <w:bookmarkStart w:id="40" w:name="_Toc40"/>
       <w:r>
         <w:t xml:space="preserve">Configuraç</w:t>
       </w:r>
@@ -12745,7 +12922,7 @@
       <w:r>
         <w:t xml:space="preserve">ões</w:t>
       </w:r>
-      <w:bookmarkEnd w:id="38"/>
+      <w:bookmarkEnd w:id="40"/>
       <w:r/>
       <w:r/>
     </w:p>
@@ -12877,11 +13054,11 @@
         <w:rPr/>
       </w:pPr>
       <w:r/>
-      <w:bookmarkStart w:id="39" w:name="_Toc39"/>
+      <w:bookmarkStart w:id="41" w:name="_Toc41"/>
       <w:r>
         <w:t xml:space="preserve">Pautas</w:t>
       </w:r>
-      <w:bookmarkEnd w:id="39"/>
+      <w:bookmarkEnd w:id="41"/>
       <w:r/>
       <w:r/>
     </w:p>
@@ -13013,14 +13190,14 @@
         <w:rPr/>
       </w:pPr>
       <w:r/>
-      <w:bookmarkStart w:id="40" w:name="_Toc40"/>
+      <w:bookmarkStart w:id="42" w:name="_Toc42"/>
       <w:r>
         <w:t xml:space="preserve">Revis</w:t>
       </w:r>
       <w:r>
         <w:t xml:space="preserve">ões</w:t>
       </w:r>
-      <w:bookmarkEnd w:id="40"/>
+      <w:bookmarkEnd w:id="42"/>
       <w:r/>
       <w:r/>
     </w:p>
@@ -13152,11 +13329,11 @@
         <w:rPr/>
       </w:pPr>
       <w:r/>
-      <w:bookmarkStart w:id="41" w:name="_Toc41"/>
+      <w:bookmarkStart w:id="43" w:name="_Toc43"/>
       <w:r>
         <w:t xml:space="preserve">Candidaturas DGES</w:t>
       </w:r>
-      <w:bookmarkEnd w:id="41"/>
+      <w:bookmarkEnd w:id="43"/>
       <w:r/>
       <w:r/>
     </w:p>
@@ -13288,11 +13465,11 @@
         <w:rPr/>
       </w:pPr>
       <w:r/>
-      <w:bookmarkStart w:id="42" w:name="_Toc42"/>
+      <w:bookmarkStart w:id="44" w:name="_Toc44"/>
       <w:r>
         <w:t xml:space="preserve">Candidaturas Locais</w:t>
       </w:r>
-      <w:bookmarkEnd w:id="42"/>
+      <w:bookmarkEnd w:id="44"/>
       <w:r/>
       <w:r/>
     </w:p>
@@ -13424,14 +13601,14 @@
         <w:rPr/>
       </w:pPr>
       <w:r/>
-      <w:bookmarkStart w:id="43" w:name="_Toc43"/>
+      <w:bookmarkStart w:id="45" w:name="_Toc45"/>
       <w:r>
         <w:t xml:space="preserve">Matr</w:t>
       </w:r>
       <w:r>
         <w:t xml:space="preserve">ículas</w:t>
       </w:r>
-      <w:bookmarkEnd w:id="43"/>
+      <w:bookmarkEnd w:id="45"/>
       <w:r/>
       <w:r/>
     </w:p>
@@ -13563,7 +13740,7 @@
         <w:rPr/>
       </w:pPr>
       <w:r/>
-      <w:bookmarkStart w:id="44" w:name="_Toc44"/>
+      <w:bookmarkStart w:id="46" w:name="_Toc46"/>
       <w:r>
         <w:t xml:space="preserve">Gest</w:t>
       </w:r>
@@ -13573,7 +13750,7 @@
       <w:r>
         <w:t xml:space="preserve">émica</w:t>
       </w:r>
-      <w:bookmarkEnd w:id="44"/>
+      <w:bookmarkEnd w:id="46"/>
       <w:r/>
       <w:r/>
     </w:p>
@@ -13715,14 +13892,14 @@
         <w:rPr/>
       </w:pPr>
       <w:r/>
-      <w:bookmarkStart w:id="45" w:name="_Toc45"/>
+      <w:bookmarkStart w:id="47" w:name="_Toc47"/>
       <w:r>
         <w:t xml:space="preserve">Hor</w:t>
       </w:r>
       <w:r>
         <w:t xml:space="preserve">ários</w:t>
       </w:r>
-      <w:bookmarkEnd w:id="45"/>
+      <w:bookmarkEnd w:id="47"/>
       <w:r/>
       <w:r/>
     </w:p>
@@ -13864,11 +14041,11 @@
         <w:rPr/>
       </w:pPr>
       <w:r/>
-      <w:bookmarkStart w:id="46" w:name="_Toc46"/>
+      <w:bookmarkStart w:id="48" w:name="_Toc48"/>
       <w:r>
         <w:t xml:space="preserve">IAM</w:t>
       </w:r>
-      <w:bookmarkEnd w:id="46"/>
+      <w:bookmarkEnd w:id="48"/>
       <w:r/>
       <w:r/>
     </w:p>
@@ -14000,14 +14177,14 @@
         <w:rPr/>
       </w:pPr>
       <w:r/>
-      <w:bookmarkStart w:id="47" w:name="_Toc47"/>
+      <w:bookmarkStart w:id="49" w:name="_Toc49"/>
       <w:r>
         <w:t xml:space="preserve">Notificaç</w:t>
       </w:r>
       <w:r>
         <w:t xml:space="preserve">ões</w:t>
       </w:r>
-      <w:bookmarkEnd w:id="47"/>
+      <w:bookmarkEnd w:id="49"/>
       <w:r/>
       <w:r/>
     </w:p>

</xml_diff>